<commit_message>
update README, handbook, quickstart
</commit_message>
<xml_diff>
--- a/documents/NightWatch_Handbook.docx
+++ b/documents/NightWatch_Handbook.docx
@@ -81,8 +81,6 @@
       <w:r>
         <w:rPr>
           <w:rFonts w:ascii="Arial" w:cs="Arial" w:eastAsia="Arial" w:hAnsi="Arial"/>
-          <w:b w:val="false"/>
-          <w:bCs w:val="false"/>
           <w:color w:val="222222"/>
           <w:sz w:val="20"/>
           <w:szCs w:val="20"/>
@@ -97,13 +95,11 @@
       <w:r>
         <w:rPr>
           <w:rFonts w:ascii="Arial" w:cs="Arial" w:eastAsia="Arial" w:hAnsi="Arial"/>
-          <w:b w:val="false"/>
-          <w:bCs w:val="false"/>
-          <w:color w:val="222222"/>
-          <w:sz w:val="20"/>
-          <w:szCs w:val="20"/>
-        </w:rPr>
-        <w:t xml:space="preserve">This handbook covers every feature of the app in detail.</w:t>
+          <w:color w:val="222222"/>
+          <w:sz w:val="20"/>
+          <w:szCs w:val="20"/>
+        </w:rPr>
+        <w:t xml:space="preserve">This handbook covers every feature in detail.</w:t>
       </w:r>
     </w:p>
     <w:p>
@@ -155,13 +151,11 @@
       <w:r>
         <w:rPr>
           <w:rFonts w:ascii="Arial" w:cs="Arial" w:eastAsia="Arial" w:hAnsi="Arial"/>
-          <w:b w:val="false"/>
-          <w:bCs w:val="false"/>
-          <w:color w:val="222222"/>
-          <w:sz w:val="20"/>
-          <w:szCs w:val="20"/>
-        </w:rPr>
-        <w:t xml:space="preserve">Night Watch is a private app for the Substorm Society community. When you open it for the first time you will be prompted for the passphrase, shared via Telegram. Once entered it is stored in your browser — you will not need to re-enter it on the same device.</w:t>
+          <w:color w:val="222222"/>
+          <w:sz w:val="20"/>
+          <w:szCs w:val="20"/>
+        </w:rPr>
+        <w:t xml:space="preserve">Night Watch is a private app for the Substorm Society community. Enter the passphrase shared via Telegram when you first open the app. It is stored in your browser — you will not need to re-enter it on the same device.</w:t>
       </w:r>
     </w:p>
     <w:p>
@@ -181,7 +175,7 @@
           <w:sz w:val="18"/>
           <w:szCs w:val="18"/>
         </w:rPr>
-        <w:t xml:space="preserve">The passphrase is rotated periodically. If the app asks you to re-enter it, check the Telegram group for the new one.</w:t>
+        <w:t xml:space="preserve">The passphrase is rotated periodically. If the app asks you to re-enter it, check the Telegram group for the current one.</w:t>
       </w:r>
     </w:p>
     <w:p>
@@ -199,22 +193,6 @@
           <w:szCs w:val="24"/>
         </w:rPr>
         <w:t xml:space="preserve">Adding to Your Home Screen</w:t>
-      </w:r>
-    </w:p>
-    <w:p>
-      <w:pPr>
-        <w:spacing w:after="80" w:before="60"/>
-      </w:pPr>
-      <w:r>
-        <w:rPr>
-          <w:rFonts w:ascii="Arial" w:cs="Arial" w:eastAsia="Arial" w:hAnsi="Arial"/>
-          <w:b w:val="false"/>
-          <w:bCs w:val="false"/>
-          <w:color w:val="222222"/>
-          <w:sz w:val="20"/>
-          <w:szCs w:val="20"/>
-        </w:rPr>
-        <w:t xml:space="preserve">For the best mobile experience, add Night Watch to your home screen:</w:t>
       </w:r>
     </w:p>
     <w:p>
@@ -304,13 +282,11 @@
       <w:r>
         <w:rPr>
           <w:rFonts w:ascii="Arial" w:cs="Arial" w:eastAsia="Arial" w:hAnsi="Arial"/>
-          <w:b w:val="false"/>
-          <w:bCs w:val="false"/>
-          <w:color w:val="222222"/>
-          <w:sz w:val="20"/>
-          <w:szCs w:val="20"/>
-        </w:rPr>
-        <w:t xml:space="preserve">The panel at the top of the screen is the main space weather dashboard, updating every 30–60 minutes. It contains the aurora intensity image, moon phase image, current Bz reading, and the stats panel.</w:t>
+          <w:color w:val="222222"/>
+          <w:sz w:val="20"/>
+          <w:szCs w:val="20"/>
+        </w:rPr>
+        <w:t xml:space="preserve">The panel at the top updates every 30–60 minutes. It shows the aurora intensity image, moon phase, current Bz, and the stats panel.</w:t>
       </w:r>
     </w:p>
     <w:p>
@@ -326,7 +302,7 @@
           <w:sz w:val="22"/>
           <w:szCs w:val="22"/>
         </w:rPr>
-        <w:t xml:space="preserve">Aurora Image</w:t>
+        <w:t xml:space="preserve">Bz Reading</w:t>
       </w:r>
     </w:p>
     <w:p>
@@ -336,13 +312,31 @@
       <w:r>
         <w:rPr>
           <w:rFonts w:ascii="Arial" w:cs="Arial" w:eastAsia="Arial" w:hAnsi="Arial"/>
-          <w:b w:val="false"/>
-          <w:bCs w:val="false"/>
-          <w:color w:val="222222"/>
-          <w:sz w:val="20"/>
-          <w:szCs w:val="20"/>
-        </w:rPr>
-        <w:t xml:space="preserve">A scene photograph matched to the current aurora intensity level across seven levels from Calm through Extreme.</w:t>
+          <w:color w:val="222222"/>
+          <w:sz w:val="20"/>
+          <w:szCs w:val="20"/>
+        </w:rPr>
+        <w:t xml:space="preserve">The interplanetary magnetic field Z-component in nanotesla. Negative (red) = southward = aurora-driving. Positive (green) = northward = aurora suppressed. More negative = stronger aurora.</w:t>
+      </w:r>
+    </w:p>
+    <w:p>
+      <w:pPr>
+        <w:pBdr>
+          <w:left w:val="single" w:color="1A7A6E" w:sz="4"/>
+        </w:pBdr>
+        <w:spacing w:after="80" w:before="80"/>
+        <w:ind w:left="360"/>
+      </w:pPr>
+      <w:r>
+        <w:rPr>
+          <w:rFonts w:ascii="Arial" w:cs="Arial" w:eastAsia="Arial" w:hAnsi="Arial"/>
+          <w:i/>
+          <w:iCs/>
+          <w:color w:val="445566"/>
+          <w:sz w:val="18"/>
+          <w:szCs w:val="18"/>
+        </w:rPr>
+        <w:t xml:space="preserve">Bz is measured at the L1 point about 1.5 million km sunward of Earth. It takes 30–60 minutes to reach Earth depending on solar wind speed.</w:t>
       </w:r>
     </w:p>
     <w:p>
@@ -358,7 +352,7 @@
           <w:sz w:val="22"/>
           <w:szCs w:val="22"/>
         </w:rPr>
-        <w:t xml:space="preserve">Bz Reading</w:t>
+        <w:t xml:space="preserve">Stats Panel</w:t>
       </w:r>
     </w:p>
     <w:p>
@@ -368,97 +362,11 @@
       <w:r>
         <w:rPr>
           <w:rFonts w:ascii="Arial" w:cs="Arial" w:eastAsia="Arial" w:hAnsi="Arial"/>
-          <w:b w:val="false"/>
-          <w:bCs w:val="false"/>
-          <w:color w:val="222222"/>
-          <w:sz w:val="20"/>
-          <w:szCs w:val="20"/>
-        </w:rPr>
-        <w:t xml:space="preserve">The interplanetary magnetic field Z-component in nanotesla. This is the most important aurora indicator. Negative (red) = southward = aurora-driving. Positive (green) = northward = aurora suppressed. More negative = stronger aurora.</w:t>
-      </w:r>
-    </w:p>
-    <w:p>
-      <w:pPr>
-        <w:pBdr>
-          <w:left w:val="single" w:color="1A7A6E" w:sz="4"/>
-        </w:pBdr>
-        <w:spacing w:after="80" w:before="80"/>
-        <w:ind w:left="360"/>
-      </w:pPr>
-      <w:r>
-        <w:rPr>
-          <w:rFonts w:ascii="Arial" w:cs="Arial" w:eastAsia="Arial" w:hAnsi="Arial"/>
-          <w:i/>
-          <w:iCs/>
-          <w:color w:val="445566"/>
-          <w:sz w:val="18"/>
-          <w:szCs w:val="18"/>
-        </w:rPr>
-        <w:t xml:space="preserve">Bz is measured at the L1 point about 1.5 million km sunward. It takes 30–60 minutes to reach Earth. The timeline bar shows this propagation delay.</w:t>
-      </w:r>
-    </w:p>
-    <w:p>
-      <w:pPr>
-        <w:spacing w:after="60" w:before="160"/>
-      </w:pPr>
-      <w:r>
-        <w:rPr>
-          <w:rFonts w:ascii="Arial" w:cs="Arial" w:eastAsia="Arial" w:hAnsi="Arial"/>
-          <w:b/>
-          <w:bCs/>
-          <w:color w:val="555555"/>
-          <w:sz w:val="22"/>
-          <w:szCs w:val="22"/>
-        </w:rPr>
-        <w:t xml:space="preserve">Stats Panel</w:t>
-      </w:r>
-    </w:p>
-    <w:p>
-      <w:pPr>
-        <w:spacing w:after="80" w:before="60"/>
-      </w:pPr>
-      <w:r>
-        <w:rPr>
-          <w:rFonts w:ascii="Arial" w:cs="Arial" w:eastAsia="Arial" w:hAnsi="Arial"/>
-          <w:b w:val="false"/>
-          <w:bCs w:val="false"/>
-          <w:color w:val="222222"/>
-          <w:sz w:val="20"/>
-          <w:szCs w:val="20"/>
-        </w:rPr>
-        <w:t xml:space="preserve">Three rows: Intensity (aurora label), Interference (moon effect, 0 when moon is below horizon), Astro Dark (percentage of full astronomical darkness at your location). The Chase Quality label combines all three.</w:t>
-      </w:r>
-    </w:p>
-    <w:p>
-      <w:pPr>
-        <w:spacing w:after="60" w:before="160"/>
-      </w:pPr>
-      <w:r>
-        <w:rPr>
-          <w:rFonts w:ascii="Arial" w:cs="Arial" w:eastAsia="Arial" w:hAnsi="Arial"/>
-          <w:b/>
-          <w:bCs/>
-          <w:color w:val="555555"/>
-          <w:sz w:val="22"/>
-          <w:szCs w:val="22"/>
-        </w:rPr>
-        <w:t xml:space="preserve">Time Label</w:t>
-      </w:r>
-    </w:p>
-    <w:p>
-      <w:pPr>
-        <w:spacing w:after="80" w:before="60"/>
-      </w:pPr>
-      <w:r>
-        <w:rPr>
-          <w:rFonts w:ascii="Arial" w:cs="Arial" w:eastAsia="Arial" w:hAnsi="Arial"/>
-          <w:b w:val="false"/>
-          <w:bCs w:val="false"/>
-          <w:color w:val="222222"/>
-          <w:sz w:val="20"/>
-          <w:szCs w:val="20"/>
-        </w:rPr>
-        <w:t xml:space="preserve">Shows current UTC and Eastern time. When viewing a future hour it shows the offset and forecast times.</w:t>
+          <w:color w:val="222222"/>
+          <w:sz w:val="20"/>
+          <w:szCs w:val="20"/>
+        </w:rPr>
+        <w:t xml:space="preserve">Three rows: Intensity (aurora label Calm through Extreme), Interference (moon effect on viewing, 0 when moon is down), Astro Dark (percentage of full astronomical darkness). The Chase Quality label summarizes all three.</w:t>
       </w:r>
     </w:p>
     <w:p>
@@ -485,146 +393,11 @@
       <w:r>
         <w:rPr>
           <w:rFonts w:ascii="Arial" w:cs="Arial" w:eastAsia="Arial" w:hAnsi="Arial"/>
-          <w:b w:val="false"/>
-          <w:bCs w:val="false"/>
-          <w:color w:val="222222"/>
-          <w:sz w:val="20"/>
-          <w:szCs w:val="20"/>
-        </w:rPr>
-        <w:t xml:space="preserve">The interactive timeline spans from 1 hour past to 8 hours future. Tap to jump to any hour.</w:t>
-      </w:r>
-    </w:p>
-    <w:p>
-      <w:pPr>
-        <w:pStyle w:val="ListParagraph"/>
-        <w:numPr>
-          <w:ilvl w:val="0"/>
-          <w:numId w:val="2"/>
-        </w:numPr>
-        <w:spacing w:after="40" w:before="40"/>
-      </w:pPr>
-      <w:r>
-        <w:rPr>
-          <w:rFonts w:ascii="Arial" w:cs="Arial" w:eastAsia="Arial" w:hAnsi="Arial"/>
-          <w:color w:val="222222"/>
-          <w:sz w:val="20"/>
-          <w:szCs w:val="20"/>
-        </w:rPr>
-        <w:t xml:space="preserve">Bz trace — red = southward, green = northward. Solid = measured L1 data shifted to Earth arrival time. Dashed = extrapolated trend.</w:t>
-      </w:r>
-    </w:p>
-    <w:p>
-      <w:pPr>
-        <w:pStyle w:val="ListParagraph"/>
-        <w:numPr>
-          <w:ilvl w:val="0"/>
-          <w:numId w:val="2"/>
-        </w:numPr>
-        <w:spacing w:after="40" w:before="40"/>
-      </w:pPr>
-      <w:r>
-        <w:rPr>
-          <w:rFonts w:ascii="Arial" w:cs="Arial" w:eastAsia="Arial" w:hAnsi="Arial"/>
-          <w:color w:val="222222"/>
-          <w:sz w:val="20"/>
-          <w:szCs w:val="20"/>
-        </w:rPr>
-        <w:t xml:space="preserve">V (blue) — solar wind velocity, fixed scale 200–1100 km/s, rises from the bottom</w:t>
-      </w:r>
-    </w:p>
-    <w:p>
-      <w:pPr>
-        <w:pStyle w:val="ListParagraph"/>
-        <w:numPr>
-          <w:ilvl w:val="0"/>
-          <w:numId w:val="2"/>
-        </w:numPr>
-        <w:spacing w:after="40" w:before="40"/>
-      </w:pPr>
-      <w:r>
-        <w:rPr>
-          <w:rFonts w:ascii="Arial" w:cs="Arial" w:eastAsia="Arial" w:hAnsi="Arial"/>
-          <w:color w:val="222222"/>
-          <w:sz w:val="20"/>
-          <w:szCs w:val="20"/>
-        </w:rPr>
-        <w:t xml:space="preserve">n (purple) — proton density, fixed scale 0–50 n/cc, rises from the bottom</w:t>
-      </w:r>
-    </w:p>
-    <w:p>
-      <w:pPr>
-        <w:pStyle w:val="ListParagraph"/>
-        <w:numPr>
-          <w:ilvl w:val="0"/>
-          <w:numId w:val="2"/>
-        </w:numPr>
-        <w:spacing w:after="40" w:before="40"/>
-      </w:pPr>
-      <w:r>
-        <w:rPr>
-          <w:rFonts w:ascii="Arial" w:cs="Arial" w:eastAsia="Arial" w:hAnsi="Arial"/>
-          <w:color w:val="222222"/>
-          <w:sz w:val="20"/>
-          <w:szCs w:val="20"/>
-        </w:rPr>
-        <w:t xml:space="preserve">Kp bars — colored bars at the bottom: observed 1-min (solid) and 3-hour forecast blocks (lighter). Color matches G-scale.</w:t>
-      </w:r>
-    </w:p>
-    <w:p>
-      <w:pPr>
-        <w:pStyle w:val="ListParagraph"/>
-        <w:numPr>
-          <w:ilvl w:val="0"/>
-          <w:numId w:val="2"/>
-        </w:numPr>
-        <w:spacing w:after="40" w:before="40"/>
-      </w:pPr>
-      <w:r>
-        <w:rPr>
-          <w:rFonts w:ascii="Arial" w:cs="Arial" w:eastAsia="Arial" w:hAnsi="Arial"/>
-          <w:color w:val="222222"/>
-          <w:sz w:val="20"/>
-          <w:szCs w:val="20"/>
-        </w:rPr>
-        <w:t xml:space="preserve">Sun shading — yellow gradient showing daylight hours</w:t>
-      </w:r>
-    </w:p>
-    <w:p>
-      <w:pPr>
-        <w:pStyle w:val="ListParagraph"/>
-        <w:numPr>
-          <w:ilvl w:val="0"/>
-          <w:numId w:val="2"/>
-        </w:numPr>
-        <w:spacing w:after="40" w:before="40"/>
-      </w:pPr>
-      <w:r>
-        <w:rPr>
-          <w:rFonts w:ascii="Arial" w:cs="Arial" w:eastAsia="Arial" w:hAnsi="Arial"/>
-          <w:color w:val="222222"/>
-          <w:sz w:val="20"/>
-          <w:szCs w:val="20"/>
-        </w:rPr>
-        <w:t xml:space="preserve">Moon shading — blue-gray band showing when the moon is above the horizon</w:t>
-      </w:r>
-    </w:p>
-    <w:p>
-      <w:pPr>
-        <w:pStyle w:val="ListParagraph"/>
-        <w:numPr>
-          <w:ilvl w:val="0"/>
-          <w:numId w:val="2"/>
-        </w:numPr>
-        <w:spacing w:after="40" w:before="40"/>
-      </w:pPr>
-      <w:r>
-        <w:rPr>
-          <w:rFonts w:ascii="Arial" w:cs="Arial" w:eastAsia="Arial" w:hAnsi="Arial"/>
-          <w:color w:val="222222"/>
-          <w:sz w:val="20"/>
-          <w:szCs w:val="20"/>
-        </w:rPr>
-        <w:t xml:space="preserve">Selected hour box — white at NOW, red when viewing a future hour</w:t>
+          <w:color w:val="222222"/>
+          <w:sz w:val="20"/>
+          <w:szCs w:val="20"/>
+        </w:rPr>
+        <w:t xml:space="preserve">The interactive timeline spans 1 hour past to 8 hours future. Tap to jump to any hour. Shows: Bz trace (red = southward, green = northward), V and n plasma traces, sun/moon shading, moonrise/set and sunrise/set markers, L1 propagation lag line, and a selected-hour box (white at NOW, red for future hours).</w:t>
       </w:r>
     </w:p>
     <w:p>
@@ -651,13 +424,11 @@
       <w:r>
         <w:rPr>
           <w:rFonts w:ascii="Arial" w:cs="Arial" w:eastAsia="Arial" w:hAnsi="Arial"/>
-          <w:b w:val="false"/>
-          <w:bCs w:val="false"/>
-          <w:color w:val="222222"/>
-          <w:sz w:val="20"/>
-          <w:szCs w:val="20"/>
-        </w:rPr>
-        <w:t xml:space="preserve">Below the map. Scrub through the 9-hour cloud and space weather forecast. Tap NOW to return to current. Tap any hour button (+1h through +8h) to jump directly.</w:t>
+          <w:color w:val="222222"/>
+          <w:sz w:val="20"/>
+          <w:szCs w:val="20"/>
+        </w:rPr>
+        <w:t xml:space="preserve">Below the map. Scrub through the 9-hour cloud and space weather forecast. Tap NOW or any hour button to jump directly.</w:t>
       </w:r>
     </w:p>
     <w:p>
@@ -679,34 +450,16 @@
     </w:p>
     <w:p>
       <w:pPr>
-        <w:spacing w:after="60" w:before="160"/>
-      </w:pPr>
-      <w:r>
-        <w:rPr>
-          <w:rFonts w:ascii="Arial" w:cs="Arial" w:eastAsia="Arial" w:hAnsi="Arial"/>
-          <w:b/>
-          <w:bCs/>
-          <w:color w:val="555555"/>
-          <w:sz w:val="22"/>
-          <w:szCs w:val="22"/>
-        </w:rPr>
-        <w:t xml:space="preserve">G Badge</w:t>
-      </w:r>
-    </w:p>
-    <w:p>
-      <w:pPr>
         <w:spacing w:after="80" w:before="60"/>
       </w:pPr>
       <w:r>
         <w:rPr>
           <w:rFonts w:ascii="Arial" w:cs="Arial" w:eastAsia="Arial" w:hAnsi="Arial"/>
-          <w:b w:val="false"/>
-          <w:bCs w:val="false"/>
-          <w:color w:val="222222"/>
-          <w:sz w:val="20"/>
-          <w:szCs w:val="20"/>
-        </w:rPr>
-        <w:t xml:space="preserve">Shows the current G-scale storm level from the real-time Kp index. Updates to show forecasted G level when scrubbing future hours.</w:t>
+          <w:color w:val="222222"/>
+          <w:sz w:val="20"/>
+          <w:szCs w:val="20"/>
+        </w:rPr>
+        <w:t xml:space="preserve">G badge shows current geomagnetic storm level derived from Kp. Updates per selected forecast hour when scrubbing. HSS badge shows High Speed Stream status — ACTIVE when solar wind speed is above 450 km/s with a fresh NOAA alert.</w:t>
       </w:r>
     </w:p>
     <w:tbl>
@@ -1358,38 +1111,6 @@
     </w:tbl>
     <w:p>
       <w:pPr>
-        <w:spacing w:after="60" w:before="160"/>
-      </w:pPr>
-      <w:r>
-        <w:rPr>
-          <w:rFonts w:ascii="Arial" w:cs="Arial" w:eastAsia="Arial" w:hAnsi="Arial"/>
-          <w:b/>
-          <w:bCs/>
-          <w:color w:val="555555"/>
-          <w:sz w:val="22"/>
-          <w:szCs w:val="22"/>
-        </w:rPr>
-        <w:t xml:space="preserve">HSS Badge</w:t>
-      </w:r>
-    </w:p>
-    <w:p>
-      <w:pPr>
-        <w:spacing w:after="80" w:before="60"/>
-      </w:pPr>
-      <w:r>
-        <w:rPr>
-          <w:rFonts w:ascii="Arial" w:cs="Arial" w:eastAsia="Arial" w:hAnsi="Arial"/>
-          <w:b w:val="false"/>
-          <w:bCs w:val="false"/>
-          <w:color w:val="222222"/>
-          <w:sz w:val="20"/>
-          <w:szCs w:val="20"/>
-        </w:rPr>
-        <w:t xml:space="preserve">High Speed Stream indicator. ACTIVE when solar wind speed is above 450 km/s with a fresh NOAA alert. WATCH when an HSS is expected but not yet arrived. Stateful — stays active while speed remains elevated.</w:t>
-      </w:r>
-    </w:p>
-    <w:p>
-      <w:pPr>
         <w:pBdr>
           <w:bottom w:val="single" w:color="DDDDDD" w:sz="4"/>
         </w:pBdr>
@@ -1437,13 +1158,11 @@
       <w:r>
         <w:rPr>
           <w:rFonts w:ascii="Arial" w:cs="Arial" w:eastAsia="Arial" w:hAnsi="Arial"/>
-          <w:b w:val="false"/>
-          <w:bCs w:val="false"/>
-          <w:color w:val="222222"/>
-          <w:sz w:val="20"/>
-          <w:szCs w:val="20"/>
-        </w:rPr>
-        <w:t xml:space="preserve">The magnifying glass in the top-left of the map opens a location search. Powered by Nominatim / OpenStreetMap. Search any city, town, landmark, park, or address in the US or Canada. Tap a result to fly the map there.</w:t>
+          <w:color w:val="222222"/>
+          <w:sz w:val="20"/>
+          <w:szCs w:val="20"/>
+        </w:rPr>
+        <w:t xml:space="preserve">Magnifying glass top-left of the map. Powered by Nominatim / OpenStreetMap. Search any city, town, park, or address in the US or Canada. Tap a result to fly the map there. Searching Peru, NY triggers a special mode.</w:t>
       </w:r>
     </w:p>
     <w:p>
@@ -1470,33 +1189,42 @@
       <w:r>
         <w:rPr>
           <w:rFonts w:ascii="Arial" w:cs="Arial" w:eastAsia="Arial" w:hAnsi="Arial"/>
-          <w:b w:val="false"/>
-          <w:bCs w:val="false"/>
-          <w:color w:val="222222"/>
-          <w:sz w:val="20"/>
-          <w:szCs w:val="20"/>
-        </w:rPr>
-        <w:t xml:space="preserve">The crescent moon button below the search icon toggles night vision mode. When active, a deep red/black CSS filter is applied to the entire app — all text, map tiles, images, and UI elements shift to red and black. Designed to preserve dark-adapted vision while out in the field. Defaults off every time the app opens.</w:t>
-      </w:r>
-    </w:p>
-    <w:p>
-      <w:pPr>
-        <w:pBdr>
-          <w:left w:val="single" w:color="1A7A6E" w:sz="4"/>
-        </w:pBdr>
-        <w:spacing w:after="80" w:before="80"/>
-        <w:ind w:left="360"/>
-      </w:pPr>
-      <w:r>
-        <w:rPr>
-          <w:rFonts w:ascii="Arial" w:cs="Arial" w:eastAsia="Arial" w:hAnsi="Arial"/>
-          <w:i/>
-          <w:iCs/>
-          <w:color w:val="445566"/>
-          <w:sz w:val="18"/>
-          <w:szCs w:val="18"/>
-        </w:rPr>
-        <w:t xml:space="preserve">Night vision mode does not affect the actual data — all layers, colors, and indicators remain fully functional. Only the visual appearance changes.</w:t>
+          <w:color w:val="222222"/>
+          <w:sz w:val="20"/>
+          <w:szCs w:val="20"/>
+        </w:rPr>
+        <w:t xml:space="preserve">Crescent moon button below search. Toggles a deep red/black CSS filter over the entire app to preserve dark-adapted vision in the field. Defaults off every time the app opens.</w:t>
+      </w:r>
+    </w:p>
+    <w:p>
+      <w:pPr>
+        <w:pStyle w:val="Heading2"/>
+        <w:spacing w:after="80" w:before="240"/>
+      </w:pPr>
+      <w:r>
+        <w:rPr>
+          <w:rFonts w:ascii="Arial" w:cs="Arial" w:eastAsia="Arial" w:hAnsi="Arial"/>
+          <w:b/>
+          <w:bCs/>
+          <w:color w:val="1A7A6E"/>
+          <w:sz w:val="24"/>
+          <w:szCs w:val="24"/>
+        </w:rPr>
+        <w:t xml:space="preserve">Camera Settings Advisor (📷)</w:t>
+      </w:r>
+    </w:p>
+    <w:p>
+      <w:pPr>
+        <w:spacing w:after="80" w:before="60"/>
+      </w:pPr>
+      <w:r>
+        <w:rPr>
+          <w:rFonts w:ascii="Arial" w:cs="Arial" w:eastAsia="Arial" w:hAnsi="Arial"/>
+          <w:color w:val="222222"/>
+          <w:sz w:val="20"/>
+          <w:szCs w:val="20"/>
+        </w:rPr>
+        <w:t xml:space="preserve">Camera button below the moon icon. Tap it, then tap anywhere on the map at your shooting location. A panel opens with location-aware recommended camera settings. See the Camera Settings Advisor section for full details.</w:t>
       </w:r>
     </w:p>
     <w:p>
@@ -1538,7 +1266,7 @@
           <w:sz w:val="24"/>
           <w:szCs w:val="24"/>
         </w:rPr>
-        <w:t xml:space="preserve">Combined Mode</w:t>
+        <w:t xml:space="preserve">Clouds</w:t>
       </w:r>
     </w:p>
     <w:p>
@@ -1548,13 +1276,11 @@
       <w:r>
         <w:rPr>
           <w:rFonts w:ascii="Arial" w:cs="Arial" w:eastAsia="Arial" w:hAnsi="Arial"/>
-          <w:b w:val="false"/>
-          <w:bCs w:val="false"/>
-          <w:color w:val="222222"/>
-          <w:sz w:val="20"/>
-          <w:szCs w:val="20"/>
-        </w:rPr>
-        <w:t xml:space="preserve">The default view. VIIRS light pollution tiles provide the base with a red cloud overlay on top. Areas that are both dark-sky and cloud-free remain transparent. This is the most useful mode for deciding where to drive.</w:t>
+          <w:color w:val="222222"/>
+          <w:sz w:val="20"/>
+          <w:szCs w:val="20"/>
+        </w:rPr>
+        <w:t xml:space="preserve">HRRR cloud cover forecast. Transparent = clear sky. Red = overcast. Areas below 10% cloud cover are transparent; 10–30% fade in gradually; above 30% renders at full opacity scaled to cloud amount. On by default.</w:t>
       </w:r>
     </w:p>
     <w:p>
@@ -1571,7 +1297,7 @@
           <w:sz w:val="24"/>
           <w:szCs w:val="24"/>
         </w:rPr>
-        <w:t xml:space="preserve">Clouds Only</w:t>
+        <w:t xml:space="preserve">Bortle</w:t>
       </w:r>
     </w:p>
     <w:p>
@@ -1581,13 +1307,25 @@
       <w:r>
         <w:rPr>
           <w:rFonts w:ascii="Arial" w:cs="Arial" w:eastAsia="Arial" w:hAnsi="Arial"/>
-          <w:b w:val="false"/>
-          <w:bCs w:val="false"/>
-          <w:color w:val="222222"/>
-          <w:sz w:val="20"/>
-          <w:szCs w:val="20"/>
-        </w:rPr>
-        <w:t xml:space="preserve">Cloud cover only. Transparent = clear. Solid red = overcast. Areas below 25% cloud cover are fully transparent.</w:t>
+          <w:color w:val="222222"/>
+          <w:sz w:val="20"/>
+          <w:szCs w:val="20"/>
+        </w:rPr>
+        <w:t xml:space="preserve">NASA GIBS VIIRS night light tiles. Transparent = dark sky. Orange/red = light polluted. On by default.</w:t>
+      </w:r>
+    </w:p>
+    <w:p>
+      <w:pPr>
+        <w:spacing w:after="80" w:before="60"/>
+      </w:pPr>
+      <w:r>
+        <w:rPr>
+          <w:rFonts w:ascii="Arial" w:cs="Arial" w:eastAsia="Arial" w:hAnsi="Arial"/>
+          <w:color w:val="222222"/>
+          <w:sz w:val="20"/>
+          <w:szCs w:val="20"/>
+        </w:rPr>
+        <w:t xml:space="preserve">When both Clouds and Bortle are active, they render as a combined overlay — light pollution tiles with cloud cover on top. Toggle either off independently to isolate clouds-only or bortle-only view.</w:t>
       </w:r>
     </w:p>
     <w:p>
@@ -1604,7 +1342,7 @@
           <w:sz w:val="24"/>
           <w:szCs w:val="24"/>
         </w:rPr>
-        <w:t xml:space="preserve">Bortle Only</w:t>
+        <w:t xml:space="preserve">Ovation Model</w:t>
       </w:r>
     </w:p>
     <w:p>
@@ -1614,13 +1352,11 @@
       <w:r>
         <w:rPr>
           <w:rFonts w:ascii="Arial" w:cs="Arial" w:eastAsia="Arial" w:hAnsi="Arial"/>
-          <w:b w:val="false"/>
-          <w:bCs w:val="false"/>
-          <w:color w:val="222222"/>
-          <w:sz w:val="20"/>
-          <w:szCs w:val="20"/>
-        </w:rPr>
-        <w:t xml:space="preserve">VIIRS light pollution only. Transparent = dark sky. Orange/red = light polluted.</w:t>
+          <w:color w:val="222222"/>
+          <w:sz w:val="20"/>
+          <w:szCs w:val="20"/>
+        </w:rPr>
+        <w:t xml:space="preserve">NOAA Ovation Prime auroral oval. Solid teal = oval boundary (aurora overhead). Dashed teal = visibility limit (aurora on northern horizon). Always shows current conditions, does not update with the time slider.</w:t>
       </w:r>
     </w:p>
     <w:p>
@@ -1637,7 +1373,7 @@
           <w:sz w:val="24"/>
           <w:szCs w:val="24"/>
         </w:rPr>
-        <w:t xml:space="preserve">Ovation Model</w:t>
+        <w:t xml:space="preserve">Locations</w:t>
       </w:r>
     </w:p>
     <w:p>
@@ -1647,13 +1383,11 @@
       <w:r>
         <w:rPr>
           <w:rFonts w:ascii="Arial" w:cs="Arial" w:eastAsia="Arial" w:hAnsi="Arial"/>
-          <w:b w:val="false"/>
-          <w:bCs w:val="false"/>
-          <w:color w:val="222222"/>
-          <w:sz w:val="20"/>
-          <w:szCs w:val="20"/>
-        </w:rPr>
-        <w:t xml:space="preserve">NOAA Ovation Prime auroral oval. Solid teal = oval boundary (aurora overhead). Dashed teal = visibility limit (aurora visible on northern horizon). Always shows current conditions, does not update with the time slider.</w:t>
+          <w:color w:val="222222"/>
+          <w:sz w:val="20"/>
+          <w:szCs w:val="20"/>
+        </w:rPr>
+        <w:t xml:space="preserve">Community dark sky spots as colored pins. Color = combined chase score for the selected hour. Red = poor, green = excellent. Tap any pin to open the spot card.</w:t>
       </w:r>
     </w:p>
     <w:p>
@@ -1670,7 +1404,7 @@
           <w:sz w:val="24"/>
           <w:szCs w:val="24"/>
         </w:rPr>
-        <w:t xml:space="preserve">Locations</w:t>
+        <w:t xml:space="preserve">Active Hunt</w:t>
       </w:r>
     </w:p>
     <w:p>
@@ -1680,13 +1414,50 @@
       <w:r>
         <w:rPr>
           <w:rFonts w:ascii="Arial" w:cs="Arial" w:eastAsia="Arial" w:hAnsi="Arial"/>
-          <w:b w:val="false"/>
-          <w:bCs w:val="false"/>
-          <w:color w:val="222222"/>
-          <w:sz w:val="20"/>
-          <w:szCs w:val="20"/>
-        </w:rPr>
-        <w:t xml:space="preserve">Community dark sky spots as colored pins. Color = combined chase score for the selected hour. Red = poor, green = excellent. Tap any pin to open the spot card.</w:t>
+          <w:color w:val="222222"/>
+          <w:sz w:val="20"/>
+          <w:szCs w:val="20"/>
+        </w:rPr>
+        <w:t xml:space="preserve">Live aurora sighting reports as fading teal rings. Each ring is 30km radius. Fresh reports are brighter; older ones fade and disappear after 5 hours. Tap inside a ring to see details.</w:t>
+      </w:r>
+    </w:p>
+    <w:p>
+      <w:pPr>
+        <w:pBdr>
+          <w:bottom w:val="single" w:color="DDDDDD" w:sz="4"/>
+        </w:pBdr>
+        <w:spacing w:after="200" w:before="200"/>
+      </w:pPr>
+    </w:p>
+    <w:p>
+      <w:pPr>
+        <w:pStyle w:val="Heading1"/>
+        <w:spacing w:after="120" w:before="360"/>
+      </w:pPr>
+      <w:r>
+        <w:rPr>
+          <w:rFonts w:ascii="Arial" w:cs="Arial" w:eastAsia="Arial" w:hAnsi="Arial"/>
+          <w:b/>
+          <w:bCs/>
+          <w:color w:val="1A1A2E"/>
+          <w:sz w:val="32"/>
+          <w:szCs w:val="32"/>
+        </w:rPr>
+        <w:t xml:space="preserve">Location Spot Cards</w:t>
+      </w:r>
+    </w:p>
+    <w:p>
+      <w:pPr>
+        <w:spacing w:after="80" w:before="60"/>
+      </w:pPr>
+      <w:r>
+        <w:rPr>
+          <w:rFonts w:ascii="Arial" w:cs="Arial" w:eastAsia="Arial" w:hAnsi="Arial"/>
+          <w:color w:val="222222"/>
+          <w:sz w:val="20"/>
+          <w:szCs w:val="20"/>
+        </w:rPr>
+        <w:t xml:space="preserve">Tap any location pin to open a spot card with three tabs.</w:t>
       </w:r>
     </w:p>
     <w:p>
@@ -1703,7 +1474,7 @@
           <w:sz w:val="24"/>
           <w:szCs w:val="24"/>
         </w:rPr>
-        <w:t xml:space="preserve">Active Hunt</w:t>
+        <w:t xml:space="preserve">Info Tab</w:t>
       </w:r>
     </w:p>
     <w:p>
@@ -1713,13 +1484,73 @@
       <w:r>
         <w:rPr>
           <w:rFonts w:ascii="Arial" w:cs="Arial" w:eastAsia="Arial" w:hAnsi="Arial"/>
-          <w:b w:val="false"/>
-          <w:bCs w:val="false"/>
-          <w:color w:val="222222"/>
-          <w:sz w:val="20"/>
-          <w:szCs w:val="20"/>
-        </w:rPr>
-        <w:t xml:space="preserve">Live aurora sighting reports as fading teal rings. Each ring is 30km radius. Fresh reports are brighter; older ones fade gradually and disappear after 5 hours. Tap inside a ring to see details.</w:t>
+          <w:color w:val="222222"/>
+          <w:sz w:val="20"/>
+          <w:szCs w:val="20"/>
+        </w:rPr>
+        <w:t xml:space="preserve">View direction, Bortle class, horizon quality (stars), access notes, and coordinates. Two score boxes: LOCATION (permanent quality from Bortle + horizon) and CHASE NOW (live score including current cloud cover at this exact location).</w:t>
+      </w:r>
+    </w:p>
+    <w:p>
+      <w:pPr>
+        <w:pStyle w:val="Heading2"/>
+        <w:spacing w:after="80" w:before="240"/>
+      </w:pPr>
+      <w:r>
+        <w:rPr>
+          <w:rFonts w:ascii="Arial" w:cs="Arial" w:eastAsia="Arial" w:hAnsi="Arial"/>
+          <w:b/>
+          <w:bCs/>
+          <w:color w:val="1A7A6E"/>
+          <w:sz w:val="24"/>
+          <w:szCs w:val="24"/>
+        </w:rPr>
+        <w:t xml:space="preserve">Forecast Tab</w:t>
+      </w:r>
+    </w:p>
+    <w:p>
+      <w:pPr>
+        <w:spacing w:after="80" w:before="60"/>
+      </w:pPr>
+      <w:r>
+        <w:rPr>
+          <w:rFonts w:ascii="Arial" w:cs="Arial" w:eastAsia="Arial" w:hAnsi="Arial"/>
+          <w:color w:val="222222"/>
+          <w:sz w:val="20"/>
+          <w:szCs w:val="20"/>
+        </w:rPr>
+        <w:t xml:space="preserve">Cloud cover percentage at this exact location for the next 8 hours as a color-coded bar chart. Green = clear, amber = partly cloudy, red = overcast. Use this to identify windows of opportunity.</w:t>
+      </w:r>
+    </w:p>
+    <w:p>
+      <w:pPr>
+        <w:pStyle w:val="Heading2"/>
+        <w:spacing w:after="80" w:before="240"/>
+      </w:pPr>
+      <w:r>
+        <w:rPr>
+          <w:rFonts w:ascii="Arial" w:cs="Arial" w:eastAsia="Arial" w:hAnsi="Arial"/>
+          <w:b/>
+          <w:bCs/>
+          <w:color w:val="1A7A6E"/>
+          <w:sz w:val="24"/>
+          <w:szCs w:val="24"/>
+        </w:rPr>
+        <w:t xml:space="preserve">Photos Tab</w:t>
+      </w:r>
+    </w:p>
+    <w:p>
+      <w:pPr>
+        <w:spacing w:after="80" w:before="60"/>
+      </w:pPr>
+      <w:r>
+        <w:rPr>
+          <w:rFonts w:ascii="Arial" w:cs="Arial" w:eastAsia="Arial" w:hAnsi="Arial"/>
+          <w:color w:val="222222"/>
+          <w:sz w:val="20"/>
+          <w:szCs w:val="20"/>
+        </w:rPr>
+        <w:t xml:space="preserve">Community aurora photos at this location. Each shows the photographer name and caption. Tap the flag icon to report inappropriate content to admin. Tap + SUBMIT A PHOTO to contribute.</w:t>
       </w:r>
     </w:p>
     <w:p>
@@ -1744,23 +1575,7 @@
           <w:sz w:val="32"/>
           <w:szCs w:val="32"/>
         </w:rPr>
-        <w:t xml:space="preserve">Location Spot Cards</w:t>
-      </w:r>
-    </w:p>
-    <w:p>
-      <w:pPr>
-        <w:spacing w:after="80" w:before="60"/>
-      </w:pPr>
-      <w:r>
-        <w:rPr>
-          <w:rFonts w:ascii="Arial" w:cs="Arial" w:eastAsia="Arial" w:hAnsi="Arial"/>
-          <w:b w:val="false"/>
-          <w:bCs w:val="false"/>
-          <w:color w:val="222222"/>
-          <w:sz w:val="20"/>
-          <w:szCs w:val="20"/>
-        </w:rPr>
-        <w:t xml:space="preserve">Tap any location pin to open a spot card with three tabs.</w:t>
+        <w:t xml:space="preserve">Community Reporting</w:t>
       </w:r>
     </w:p>
     <w:p>
@@ -1777,7 +1592,7 @@
           <w:sz w:val="24"/>
           <w:szCs w:val="24"/>
         </w:rPr>
-        <w:t xml:space="preserve">Info Tab</w:t>
+        <w:t xml:space="preserve">Submitting a Dark Sky Spot</w:t>
       </w:r>
     </w:p>
     <w:p>
@@ -1787,137 +1602,11 @@
       <w:r>
         <w:rPr>
           <w:rFonts w:ascii="Arial" w:cs="Arial" w:eastAsia="Arial" w:hAnsi="Arial"/>
-          <w:b w:val="false"/>
-          <w:bCs w:val="false"/>
-          <w:color w:val="222222"/>
-          <w:sz w:val="20"/>
-          <w:szCs w:val="20"/>
-        </w:rPr>
-        <w:t xml:space="preserve">View direction, Bortle class, horizon quality (stars), access notes, and coordinates. Two score boxes: LOCATION (permanent quality from Bortle + horizon) and CHASE NOW (live score including current cloud cover).</w:t>
-      </w:r>
-    </w:p>
-    <w:p>
-      <w:pPr>
-        <w:pStyle w:val="Heading2"/>
-        <w:spacing w:after="80" w:before="240"/>
-      </w:pPr>
-      <w:r>
-        <w:rPr>
-          <w:rFonts w:ascii="Arial" w:cs="Arial" w:eastAsia="Arial" w:hAnsi="Arial"/>
-          <w:b/>
-          <w:bCs/>
-          <w:color w:val="1A7A6E"/>
-          <w:sz w:val="24"/>
-          <w:szCs w:val="24"/>
-        </w:rPr>
-        <w:t xml:space="preserve">Forecast Tab</w:t>
-      </w:r>
-    </w:p>
-    <w:p>
-      <w:pPr>
-        <w:spacing w:after="80" w:before="60"/>
-      </w:pPr>
-      <w:r>
-        <w:rPr>
-          <w:rFonts w:ascii="Arial" w:cs="Arial" w:eastAsia="Arial" w:hAnsi="Arial"/>
-          <w:b w:val="false"/>
-          <w:bCs w:val="false"/>
-          <w:color w:val="222222"/>
-          <w:sz w:val="20"/>
-          <w:szCs w:val="20"/>
-        </w:rPr>
-        <w:t xml:space="preserve">Cloud cover percentage at this exact location for the next 8 hours. Identifies windows when clouds may clear.</w:t>
-      </w:r>
-    </w:p>
-    <w:p>
-      <w:pPr>
-        <w:pStyle w:val="Heading2"/>
-        <w:spacing w:after="80" w:before="240"/>
-      </w:pPr>
-      <w:r>
-        <w:rPr>
-          <w:rFonts w:ascii="Arial" w:cs="Arial" w:eastAsia="Arial" w:hAnsi="Arial"/>
-          <w:b/>
-          <w:bCs/>
-          <w:color w:val="1A7A6E"/>
-          <w:sz w:val="24"/>
-          <w:szCs w:val="24"/>
-        </w:rPr>
-        <w:t xml:space="preserve">Photos Tab</w:t>
-      </w:r>
-    </w:p>
-    <w:p>
-      <w:pPr>
-        <w:spacing w:after="80" w:before="60"/>
-      </w:pPr>
-      <w:r>
-        <w:rPr>
-          <w:rFonts w:ascii="Arial" w:cs="Arial" w:eastAsia="Arial" w:hAnsi="Arial"/>
-          <w:b w:val="false"/>
-          <w:bCs w:val="false"/>
-          <w:color w:val="222222"/>
-          <w:sz w:val="20"/>
-          <w:szCs w:val="20"/>
-        </w:rPr>
-        <w:t xml:space="preserve">Community aurora photos at this location. Each shows the photographer name and caption. Tap 🚩 to flag a photo for admin review. Tap + SUBMIT A PHOTO to contribute.</w:t>
-      </w:r>
-    </w:p>
-    <w:p>
-      <w:pPr>
-        <w:pBdr>
-          <w:bottom w:val="single" w:color="DDDDDD" w:sz="4"/>
-        </w:pBdr>
-        <w:spacing w:after="200" w:before="200"/>
-      </w:pPr>
-    </w:p>
-    <w:p>
-      <w:pPr>
-        <w:pStyle w:val="Heading1"/>
-        <w:spacing w:after="120" w:before="360"/>
-      </w:pPr>
-      <w:r>
-        <w:rPr>
-          <w:rFonts w:ascii="Arial" w:cs="Arial" w:eastAsia="Arial" w:hAnsi="Arial"/>
-          <w:b/>
-          <w:bCs/>
-          <w:color w:val="1A1A2E"/>
-          <w:sz w:val="32"/>
-          <w:szCs w:val="32"/>
-        </w:rPr>
-        <w:t xml:space="preserve">Community Reporting</w:t>
-      </w:r>
-    </w:p>
-    <w:p>
-      <w:pPr>
-        <w:pStyle w:val="Heading2"/>
-        <w:spacing w:after="80" w:before="240"/>
-      </w:pPr>
-      <w:r>
-        <w:rPr>
-          <w:rFonts w:ascii="Arial" w:cs="Arial" w:eastAsia="Arial" w:hAnsi="Arial"/>
-          <w:b/>
-          <w:bCs/>
-          <w:color w:val="1A7A6E"/>
-          <w:sz w:val="24"/>
-          <w:szCs w:val="24"/>
-        </w:rPr>
-        <w:t xml:space="preserve">Submitting a Dark Sky Spot</w:t>
-      </w:r>
-    </w:p>
-    <w:p>
-      <w:pPr>
-        <w:spacing w:after="80" w:before="60"/>
-      </w:pPr>
-      <w:r>
-        <w:rPr>
-          <w:rFonts w:ascii="Arial" w:cs="Arial" w:eastAsia="Arial" w:hAnsi="Arial"/>
-          <w:b w:val="false"/>
-          <w:bCs w:val="false"/>
-          <w:color w:val="222222"/>
-          <w:sz w:val="20"/>
-          <w:szCs w:val="20"/>
-        </w:rPr>
-        <w:t xml:space="preserve">Tap + PLACE PIN in the bottom bar, tap the map at the location, fill in the form, and submit for admin review.</w:t>
+          <w:color w:val="222222"/>
+          <w:sz w:val="20"/>
+          <w:szCs w:val="20"/>
+        </w:rPr>
+        <w:t xml:space="preserve">Tap + PLACE PIN in the bottom bar, tap the map at the location, fill in the form, and submit for admin review. All fields start blank — fill in what you know.</w:t>
       </w:r>
     </w:p>
     <w:p>
@@ -1974,7 +1663,7 @@
           <w:sz w:val="20"/>
           <w:szCs w:val="20"/>
         </w:rPr>
-        <w:t xml:space="preserve">View direction — best direction for aurora viewing</w:t>
+        <w:t xml:space="preserve">View direction — best compass direction for aurora viewing</w:t>
       </w:r>
     </w:p>
     <w:p>
@@ -2039,13 +1728,11 @@
       <w:r>
         <w:rPr>
           <w:rFonts w:ascii="Arial" w:cs="Arial" w:eastAsia="Arial" w:hAnsi="Arial"/>
-          <w:b w:val="false"/>
-          <w:bCs w:val="false"/>
-          <w:color w:val="222222"/>
-          <w:sz w:val="20"/>
-          <w:szCs w:val="20"/>
-        </w:rPr>
-        <w:t xml:space="preserve">Open a spot card → Photos tab → + SUBMIT A PHOTO. Select a photo, optionally add your name/handle and a caption, and submit. Photos are automatically compressed if over 8MB. They appear after admin approval.</w:t>
+          <w:color w:val="222222"/>
+          <w:sz w:val="20"/>
+          <w:szCs w:val="20"/>
+        </w:rPr>
+        <w:t xml:space="preserve">Open a spot card → Photos tab → + SUBMIT A PHOTO. Photos are automatically compressed if over 8MB. Optionally add your name and a caption. Photos appear after admin approval.</w:t>
       </w:r>
     </w:p>
     <w:p>
@@ -2072,8 +1759,6 @@
       <w:r>
         <w:rPr>
           <w:rFonts w:ascii="Arial" w:cs="Arial" w:eastAsia="Arial" w:hAnsi="Arial"/>
-          <w:b w:val="false"/>
-          <w:bCs w:val="false"/>
           <w:color w:val="222222"/>
           <w:sz w:val="20"/>
           <w:szCs w:val="20"/>
@@ -2088,8 +1773,6 @@
       <w:r>
         <w:rPr>
           <w:rFonts w:ascii="Arial" w:cs="Arial" w:eastAsia="Arial" w:hAnsi="Arial"/>
-          <w:b w:val="false"/>
-          <w:bCs w:val="false"/>
           <w:color w:val="222222"/>
           <w:sz w:val="20"/>
           <w:szCs w:val="20"/>
@@ -2172,7 +1855,7 @@
                 <w:sz w:val="18"/>
                 <w:szCs w:val="18"/>
               </w:rPr>
-              <w:t xml:space="preserve">Meaning</w:t>
+              <w:t xml:space="preserve">What it means</w:t>
             </w:r>
           </w:p>
         </w:tc>
@@ -2718,6 +2401,51 @@
         </w:tc>
       </w:tr>
     </w:tbl>
+    <w:p>
+      <w:pPr>
+        <w:pStyle w:val="Heading2"/>
+        <w:spacing w:after="80" w:before="240"/>
+      </w:pPr>
+      <w:r>
+        <w:rPr>
+          <w:rFonts w:ascii="Arial" w:cs="Arial" w:eastAsia="Arial" w:hAnsi="Arial"/>
+          <w:b/>
+          <w:bCs/>
+          <w:color w:val="1A7A6E"/>
+          <w:sz w:val="24"/>
+          <w:szCs w:val="24"/>
+        </w:rPr>
+        <w:t xml:space="preserve">Undoing a Sighting</w:t>
+      </w:r>
+    </w:p>
+    <w:p>
+      <w:pPr>
+        <w:spacing w:after="80" w:before="60"/>
+      </w:pPr>
+      <w:r>
+        <w:rPr>
+          <w:rFonts w:ascii="Arial" w:cs="Arial" w:eastAsia="Arial" w:hAnsi="Arial"/>
+          <w:color w:val="222222"/>
+          <w:sz w:val="20"/>
+          <w:szCs w:val="20"/>
+        </w:rPr>
+        <w:t xml:space="preserve">If you submitted a sighting by accident, tap the ring on the map. If you are on the same device and browser that submitted it, you will see an "Undo My Sighting" button. Tapping it asks for confirmation, then removes the sighting immediately without admin involvement.</w:t>
+      </w:r>
+    </w:p>
+    <w:p>
+      <w:pPr>
+        <w:spacing w:after="80" w:before="60"/>
+      </w:pPr>
+      <w:r>
+        <w:rPr>
+          <w:rFonts w:ascii="Arial" w:cs="Arial" w:eastAsia="Arial" w:hAnsi="Arial"/>
+          <w:color w:val="222222"/>
+          <w:sz w:val="20"/>
+          <w:szCs w:val="20"/>
+        </w:rPr>
+        <w:t xml:space="preserve">If you are on a different device or the session has been cleared, tap "Request Removal" and add a reason. This sends the request to the admin queue for review.</w:t>
+      </w:r>
+    </w:p>
     <w:p>
       <w:pPr>
         <w:pBdr>
@@ -2740,7 +2468,7 @@
           <w:sz w:val="32"/>
           <w:szCs w:val="32"/>
         </w:rPr>
-        <w:t xml:space="preserve">Admin Features</w:t>
+        <w:t xml:space="preserve">Camera Settings Advisor</w:t>
       </w:r>
     </w:p>
     <w:p>
@@ -2750,13 +2478,11 @@
       <w:r>
         <w:rPr>
           <w:rFonts w:ascii="Arial" w:cs="Arial" w:eastAsia="Arial" w:hAnsi="Arial"/>
-          <w:b w:val="false"/>
-          <w:bCs w:val="false"/>
-          <w:color w:val="222222"/>
-          <w:sz w:val="20"/>
-          <w:szCs w:val="20"/>
-        </w:rPr>
-        <w:t xml:space="preserve">Enter the admin passphrase in the bottom bar password field and tap GO. The QUEUE button appears.</w:t>
+          <w:color w:val="222222"/>
+          <w:sz w:val="20"/>
+          <w:szCs w:val="20"/>
+        </w:rPr>
+        <w:t xml:space="preserve">The camera advisor calculates recommended aurora photography settings based on your device, location, and current conditions.</w:t>
       </w:r>
     </w:p>
     <w:p>
@@ -2773,23 +2499,178 @@
           <w:sz w:val="24"/>
           <w:szCs w:val="24"/>
         </w:rPr>
-        <w:t xml:space="preserve">Spots Tab</w:t>
-      </w:r>
-    </w:p>
-    <w:p>
-      <w:pPr>
-        <w:spacing w:after="80" w:before="60"/>
-      </w:pPr>
-      <w:r>
-        <w:rPr>
-          <w:rFonts w:ascii="Arial" w:cs="Arial" w:eastAsia="Arial" w:hAnsi="Arial"/>
-          <w:b w:val="false"/>
-          <w:bCs w:val="false"/>
-          <w:color w:val="222222"/>
-          <w:sz w:val="20"/>
-          <w:szCs w:val="20"/>
-        </w:rPr>
-        <w:t xml:space="preserve">Pending location submissions. APPROVE adds the spot to the public map. REJECT soft-deletes it with a timestamp (kept for audit history, not shown publicly).</w:t>
+        <w:t xml:space="preserve">How to Use</w:t>
+      </w:r>
+    </w:p>
+    <w:p>
+      <w:pPr>
+        <w:pStyle w:val="ListParagraph"/>
+        <w:numPr>
+          <w:ilvl w:val="0"/>
+          <w:numId w:val="2"/>
+        </w:numPr>
+        <w:spacing w:after="40" w:before="40"/>
+      </w:pPr>
+      <w:r>
+        <w:rPr>
+          <w:rFonts w:ascii="Arial" w:cs="Arial" w:eastAsia="Arial" w:hAnsi="Arial"/>
+          <w:color w:val="222222"/>
+          <w:sz w:val="20"/>
+          <w:szCs w:val="20"/>
+        </w:rPr>
+        <w:t xml:space="preserve">Tap 📷 on the map — cursor changes to crosshair</w:t>
+      </w:r>
+    </w:p>
+    <w:p>
+      <w:pPr>
+        <w:pStyle w:val="ListParagraph"/>
+        <w:numPr>
+          <w:ilvl w:val="0"/>
+          <w:numId w:val="2"/>
+        </w:numPr>
+        <w:spacing w:after="40" w:before="40"/>
+      </w:pPr>
+      <w:r>
+        <w:rPr>
+          <w:rFonts w:ascii="Arial" w:cs="Arial" w:eastAsia="Arial" w:hAnsi="Arial"/>
+          <w:color w:val="222222"/>
+          <w:sz w:val="20"/>
+          <w:szCs w:val="20"/>
+        </w:rPr>
+        <w:t xml:space="preserve">Tap your shooting location on the map</w:t>
+      </w:r>
+    </w:p>
+    <w:p>
+      <w:pPr>
+        <w:pStyle w:val="ListParagraph"/>
+        <w:numPr>
+          <w:ilvl w:val="0"/>
+          <w:numId w:val="2"/>
+        </w:numPr>
+        <w:spacing w:after="40" w:before="40"/>
+      </w:pPr>
+      <w:r>
+        <w:rPr>
+          <w:rFonts w:ascii="Arial" w:cs="Arial" w:eastAsia="Arial" w:hAnsi="Arial"/>
+          <w:color w:val="222222"/>
+          <w:sz w:val="20"/>
+          <w:szCs w:val="20"/>
+        </w:rPr>
+        <w:t xml:space="preserve">The panel opens with auto-detected Bortle, latitude, moon data, and live aurora intensity</w:t>
+      </w:r>
+    </w:p>
+    <w:p>
+      <w:pPr>
+        <w:pStyle w:val="ListParagraph"/>
+        <w:numPr>
+          <w:ilvl w:val="0"/>
+          <w:numId w:val="2"/>
+        </w:numPr>
+        <w:spacing w:after="40" w:before="40"/>
+      </w:pPr>
+      <w:r>
+        <w:rPr>
+          <w:rFonts w:ascii="Arial" w:cs="Arial" w:eastAsia="Arial" w:hAnsi="Arial"/>
+          <w:color w:val="222222"/>
+          <w:sz w:val="20"/>
+          <w:szCs w:val="20"/>
+        </w:rPr>
+        <w:t xml:space="preserve">Select your device type — iPhone, Android, or DSLR/Mirrorless</w:t>
+      </w:r>
+    </w:p>
+    <w:p>
+      <w:pPr>
+        <w:pStyle w:val="ListParagraph"/>
+        <w:numPr>
+          <w:ilvl w:val="0"/>
+          <w:numId w:val="2"/>
+        </w:numPr>
+        <w:spacing w:after="40" w:before="40"/>
+      </w:pPr>
+      <w:r>
+        <w:rPr>
+          <w:rFonts w:ascii="Arial" w:cs="Arial" w:eastAsia="Arial" w:hAnsi="Arial"/>
+          <w:color w:val="222222"/>
+          <w:sz w:val="20"/>
+          <w:szCs w:val="20"/>
+        </w:rPr>
+        <w:t xml:space="preserve">For phones: pick your model from the dropdown — specs are looked up automatically</w:t>
+      </w:r>
+    </w:p>
+    <w:p>
+      <w:pPr>
+        <w:pStyle w:val="ListParagraph"/>
+        <w:numPr>
+          <w:ilvl w:val="0"/>
+          <w:numId w:val="2"/>
+        </w:numPr>
+        <w:spacing w:after="40" w:before="40"/>
+      </w:pPr>
+      <w:r>
+        <w:rPr>
+          <w:rFonts w:ascii="Arial" w:cs="Arial" w:eastAsia="Arial" w:hAnsi="Arial"/>
+          <w:color w:val="222222"/>
+          <w:sz w:val="20"/>
+          <w:szCs w:val="20"/>
+        </w:rPr>
+        <w:t xml:space="preserve">For DSLRs: enter sensor size, focal length, and widest aperture</w:t>
+      </w:r>
+    </w:p>
+    <w:p>
+      <w:pPr>
+        <w:pStyle w:val="ListParagraph"/>
+        <w:numPr>
+          <w:ilvl w:val="0"/>
+          <w:numId w:val="2"/>
+        </w:numPr>
+        <w:spacing w:after="40" w:before="40"/>
+      </w:pPr>
+      <w:r>
+        <w:rPr>
+          <w:rFonts w:ascii="Arial" w:cs="Arial" w:eastAsia="Arial" w:hAnsi="Arial"/>
+          <w:color w:val="222222"/>
+          <w:sz w:val="20"/>
+          <w:szCs w:val="20"/>
+        </w:rPr>
+        <w:t xml:space="preserve">Check whether you have a tripod (and star tracker for DSLRs)</w:t>
+      </w:r>
+    </w:p>
+    <w:p>
+      <w:pPr>
+        <w:pStyle w:val="ListParagraph"/>
+        <w:numPr>
+          <w:ilvl w:val="0"/>
+          <w:numId w:val="2"/>
+        </w:numPr>
+        <w:spacing w:after="40" w:before="40"/>
+      </w:pPr>
+      <w:r>
+        <w:rPr>
+          <w:rFonts w:ascii="Arial" w:cs="Arial" w:eastAsia="Arial" w:hAnsi="Arial"/>
+          <w:color w:val="222222"/>
+          <w:sz w:val="20"/>
+          <w:szCs w:val="20"/>
+        </w:rPr>
+        <w:t xml:space="preserve">Optionally override any condition — Bortle, moon, latitude, or aurora intensity</w:t>
+      </w:r>
+    </w:p>
+    <w:p>
+      <w:pPr>
+        <w:pStyle w:val="ListParagraph"/>
+        <w:numPr>
+          <w:ilvl w:val="0"/>
+          <w:numId w:val="2"/>
+        </w:numPr>
+        <w:spacing w:after="40" w:before="40"/>
+      </w:pPr>
+      <w:r>
+        <w:rPr>
+          <w:rFonts w:ascii="Arial" w:cs="Arial" w:eastAsia="Arial" w:hAnsi="Arial"/>
+          <w:color w:val="222222"/>
+          <w:sz w:val="20"/>
+          <w:szCs w:val="20"/>
+        </w:rPr>
+        <w:t xml:space="preserve">Tap GET SETTINGS for your recommended output card</w:t>
       </w:r>
     </w:p>
     <w:p>
@@ -2806,7 +2687,7 @@
           <w:sz w:val="24"/>
           <w:szCs w:val="24"/>
         </w:rPr>
-        <w:t xml:space="preserve">Photos Tab</w:t>
+        <w:t xml:space="preserve">Output</w:t>
       </w:r>
     </w:p>
     <w:p>
@@ -2816,13 +2697,25 @@
       <w:r>
         <w:rPr>
           <w:rFonts w:ascii="Arial" w:cs="Arial" w:eastAsia="Arial" w:hAnsi="Arial"/>
-          <w:b w:val="false"/>
-          <w:bCs w:val="false"/>
-          <w:color w:val="222222"/>
-          <w:sz w:val="20"/>
-          <w:szCs w:val="20"/>
-        </w:rPr>
-        <w:t xml:space="preserve">Pending photo submissions. APPROVE makes the photo public. REJECT removes it.</w:t>
+          <w:color w:val="222222"/>
+          <w:sz w:val="20"/>
+          <w:szCs w:val="20"/>
+        </w:rPr>
+        <w:t xml:space="preserve">The output card shows: Mode, Aperture, Shutter speed, ISO, White balance, Focus instructions, Format recommendation, and contextual warnings about moon interference or light pollution.</w:t>
+      </w:r>
+    </w:p>
+    <w:p>
+      <w:pPr>
+        <w:spacing w:after="80" w:before="60"/>
+      </w:pPr>
+      <w:r>
+        <w:rPr>
+          <w:rFonts w:ascii="Arial" w:cs="Arial" w:eastAsia="Arial" w:hAnsi="Arial"/>
+          <w:color w:val="222222"/>
+          <w:sz w:val="20"/>
+          <w:szCs w:val="20"/>
+        </w:rPr>
+        <w:t xml:space="preserve">A creative note explains the tradeoff: longer exposure = more color and smooth gradients, shorter exposure = sharper structure and ribbon detail.</w:t>
       </w:r>
     </w:p>
     <w:p>
@@ -2839,7 +2732,7 @@
           <w:sz w:val="24"/>
           <w:szCs w:val="24"/>
         </w:rPr>
-        <w:t xml:space="preserve">Flagged Tab</w:t>
+        <w:t xml:space="preserve">Troubleshooter</w:t>
       </w:r>
     </w:p>
     <w:p>
@@ -2849,13 +2742,611 @@
       <w:r>
         <w:rPr>
           <w:rFonts w:ascii="Arial" w:cs="Arial" w:eastAsia="Arial" w:hAnsi="Arial"/>
-          <w:b w:val="false"/>
-          <w:bCs w:val="false"/>
-          <w:color w:val="222222"/>
-          <w:sz w:val="20"/>
-          <w:szCs w:val="20"/>
-        </w:rPr>
-        <w:t xml:space="preserve">Photos flagged by community members. DELETE permanently removes the photo from the map and queues it for nightly Cloudinary cleanup. DISMISS clears the flag and leaves the photo published.</w:t>
+          <w:color w:val="222222"/>
+          <w:sz w:val="20"/>
+          <w:szCs w:val="20"/>
+        </w:rPr>
+        <w:t xml:space="preserve">Tap TROUBLESHOOT A PROBLEM at the bottom of the results card. Check one or more symptom boxes and tap GET FIXES. Each fix references your actual entered settings with specific values — not generic advice.</w:t>
+      </w:r>
+    </w:p>
+    <w:tbl>
+      <w:tblPr>
+        <w:tblW w:type="dxa" w:w="9360"/>
+        <w:tblBorders>
+          <w:top w:val="single" w:color="auto" w:sz="4"/>
+          <w:left w:val="single" w:color="auto" w:sz="4"/>
+          <w:bottom w:val="single" w:color="auto" w:sz="4"/>
+          <w:right w:val="single" w:color="auto" w:sz="4"/>
+          <w:insideH w:val="single" w:color="auto" w:sz="4"/>
+          <w:insideV w:val="single" w:color="auto" w:sz="4"/>
+        </w:tblBorders>
+      </w:tblPr>
+      <w:tblGrid>
+        <w:gridCol w:w="4680"/>
+        <w:gridCol w:w="4680"/>
+      </w:tblGrid>
+      <w:tr>
+        <w:tc>
+          <w:tcPr>
+            <w:tcW w:type="dxa" w:w="4680"/>
+            <w:tcBorders>
+              <w:top w:val="single" w:color="CCCCCC" w:sz="1"/>
+              <w:left w:val="single" w:color="CCCCCC" w:sz="1"/>
+              <w:bottom w:val="single" w:color="CCCCCC" w:sz="1"/>
+              <w:right w:val="single" w:color="CCCCCC" w:sz="1"/>
+            </w:tcBorders>
+            <w:shd w:fill="1A7A6E" w:val="clear"/>
+            <w:tcMar>
+              <w:top w:type="dxa" w:w="80"/>
+              <w:left w:type="dxa" w:w="120"/>
+              <w:bottom w:type="dxa" w:w="80"/>
+              <w:right w:type="dxa" w:w="120"/>
+            </w:tcMar>
+          </w:tcPr>
+          <w:p>
+            <w:r>
+              <w:rPr>
+                <w:rFonts w:ascii="Arial" w:cs="Arial" w:eastAsia="Arial" w:hAnsi="Arial"/>
+                <w:b/>
+                <w:bCs/>
+                <w:color w:val="FFFFFF"/>
+                <w:sz w:val="18"/>
+                <w:szCs w:val="18"/>
+              </w:rPr>
+              <w:t xml:space="preserve">Symptom</w:t>
+            </w:r>
+          </w:p>
+        </w:tc>
+        <w:tc>
+          <w:tcPr>
+            <w:tcW w:type="dxa" w:w="4680"/>
+            <w:tcBorders>
+              <w:top w:val="single" w:color="CCCCCC" w:sz="1"/>
+              <w:left w:val="single" w:color="CCCCCC" w:sz="1"/>
+              <w:bottom w:val="single" w:color="CCCCCC" w:sz="1"/>
+              <w:right w:val="single" w:color="CCCCCC" w:sz="1"/>
+            </w:tcBorders>
+            <w:shd w:fill="1A7A6E" w:val="clear"/>
+            <w:tcMar>
+              <w:top w:type="dxa" w:w="80"/>
+              <w:left w:type="dxa" w:w="120"/>
+              <w:bottom w:type="dxa" w:w="80"/>
+              <w:right w:type="dxa" w:w="120"/>
+            </w:tcMar>
+          </w:tcPr>
+          <w:p>
+            <w:r>
+              <w:rPr>
+                <w:rFonts w:ascii="Arial" w:cs="Arial" w:eastAsia="Arial" w:hAnsi="Arial"/>
+                <w:b/>
+                <w:bCs/>
+                <w:color w:val="FFFFFF"/>
+                <w:sz w:val="18"/>
+                <w:szCs w:val="18"/>
+              </w:rPr>
+              <w:t xml:space="preserve">What to adjust</w:t>
+            </w:r>
+          </w:p>
+        </w:tc>
+      </w:tr>
+      <w:tr>
+        <w:tc>
+          <w:tcPr>
+            <w:tcW w:type="dxa" w:w="4680"/>
+            <w:tcBorders>
+              <w:top w:val="single" w:color="CCCCCC" w:sz="1"/>
+              <w:left w:val="single" w:color="CCCCCC" w:sz="1"/>
+              <w:bottom w:val="single" w:color="CCCCCC" w:sz="1"/>
+              <w:right w:val="single" w:color="CCCCCC" w:sz="1"/>
+            </w:tcBorders>
+            <w:shd w:fill="F5FAFA" w:val="clear"/>
+            <w:tcMar>
+              <w:top w:type="dxa" w:w="80"/>
+              <w:left w:type="dxa" w:w="120"/>
+              <w:bottom w:type="dxa" w:w="80"/>
+              <w:right w:type="dxa" w:w="120"/>
+            </w:tcMar>
+          </w:tcPr>
+          <w:p>
+            <w:r>
+              <w:rPr>
+                <w:rFonts w:ascii="Arial" w:cs="Arial" w:eastAsia="Arial" w:hAnsi="Arial"/>
+                <w:color w:val="222222"/>
+                <w:sz w:val="18"/>
+                <w:szCs w:val="18"/>
+              </w:rPr>
+              <w:t xml:space="preserve">Photo too dark</w:t>
+            </w:r>
+          </w:p>
+        </w:tc>
+        <w:tc>
+          <w:tcPr>
+            <w:tcW w:type="dxa" w:w="4680"/>
+            <w:tcBorders>
+              <w:top w:val="single" w:color="CCCCCC" w:sz="1"/>
+              <w:left w:val="single" w:color="CCCCCC" w:sz="1"/>
+              <w:bottom w:val="single" w:color="CCCCCC" w:sz="1"/>
+              <w:right w:val="single" w:color="CCCCCC" w:sz="1"/>
+            </w:tcBorders>
+            <w:shd w:fill="F5FAFA" w:val="clear"/>
+            <w:tcMar>
+              <w:top w:type="dxa" w:w="80"/>
+              <w:left w:type="dxa" w:w="120"/>
+              <w:bottom w:type="dxa" w:w="80"/>
+              <w:right w:type="dxa" w:w="120"/>
+            </w:tcMar>
+          </w:tcPr>
+          <w:p>
+            <w:r>
+              <w:rPr>
+                <w:rFonts w:ascii="Arial" w:cs="Arial" w:eastAsia="Arial" w:hAnsi="Arial"/>
+                <w:color w:val="222222"/>
+                <w:sz w:val="18"/>
+                <w:szCs w:val="18"/>
+              </w:rPr>
+              <w:t xml:space="preserve">Raise ISO one stop or increase shutter 50%</w:t>
+            </w:r>
+          </w:p>
+        </w:tc>
+      </w:tr>
+      <w:tr>
+        <w:tc>
+          <w:tcPr>
+            <w:tcW w:type="dxa" w:w="4680"/>
+            <w:tcBorders>
+              <w:top w:val="single" w:color="CCCCCC" w:sz="1"/>
+              <w:left w:val="single" w:color="CCCCCC" w:sz="1"/>
+              <w:bottom w:val="single" w:color="CCCCCC" w:sz="1"/>
+              <w:right w:val="single" w:color="CCCCCC" w:sz="1"/>
+            </w:tcBorders>
+            <w:shd w:fill="FFFFFF" w:val="clear"/>
+            <w:tcMar>
+              <w:top w:type="dxa" w:w="80"/>
+              <w:left w:type="dxa" w:w="120"/>
+              <w:bottom w:type="dxa" w:w="80"/>
+              <w:right w:type="dxa" w:w="120"/>
+            </w:tcMar>
+          </w:tcPr>
+          <w:p>
+            <w:r>
+              <w:rPr>
+                <w:rFonts w:ascii="Arial" w:cs="Arial" w:eastAsia="Arial" w:hAnsi="Arial"/>
+                <w:color w:val="222222"/>
+                <w:sz w:val="18"/>
+                <w:szCs w:val="18"/>
+              </w:rPr>
+              <w:t xml:space="preserve">Photo too bright</w:t>
+            </w:r>
+          </w:p>
+        </w:tc>
+        <w:tc>
+          <w:tcPr>
+            <w:tcW w:type="dxa" w:w="4680"/>
+            <w:tcBorders>
+              <w:top w:val="single" w:color="CCCCCC" w:sz="1"/>
+              <w:left w:val="single" w:color="CCCCCC" w:sz="1"/>
+              <w:bottom w:val="single" w:color="CCCCCC" w:sz="1"/>
+              <w:right w:val="single" w:color="CCCCCC" w:sz="1"/>
+            </w:tcBorders>
+            <w:shd w:fill="FFFFFF" w:val="clear"/>
+            <w:tcMar>
+              <w:top w:type="dxa" w:w="80"/>
+              <w:left w:type="dxa" w:w="120"/>
+              <w:bottom w:type="dxa" w:w="80"/>
+              <w:right w:type="dxa" w:w="120"/>
+            </w:tcMar>
+          </w:tcPr>
+          <w:p>
+            <w:r>
+              <w:rPr>
+                <w:rFonts w:ascii="Arial" w:cs="Arial" w:eastAsia="Arial" w:hAnsi="Arial"/>
+                <w:color w:val="222222"/>
+                <w:sz w:val="18"/>
+                <w:szCs w:val="18"/>
+              </w:rPr>
+              <w:t xml:space="preserve">Lower ISO one stop or decrease shutter 30%</w:t>
+            </w:r>
+          </w:p>
+        </w:tc>
+      </w:tr>
+      <w:tr>
+        <w:tc>
+          <w:tcPr>
+            <w:tcW w:type="dxa" w:w="4680"/>
+            <w:tcBorders>
+              <w:top w:val="single" w:color="CCCCCC" w:sz="1"/>
+              <w:left w:val="single" w:color="CCCCCC" w:sz="1"/>
+              <w:bottom w:val="single" w:color="CCCCCC" w:sz="1"/>
+              <w:right w:val="single" w:color="CCCCCC" w:sz="1"/>
+            </w:tcBorders>
+            <w:shd w:fill="F5FAFA" w:val="clear"/>
+            <w:tcMar>
+              <w:top w:type="dxa" w:w="80"/>
+              <w:left w:type="dxa" w:w="120"/>
+              <w:bottom w:type="dxa" w:w="80"/>
+              <w:right w:type="dxa" w:w="120"/>
+            </w:tcMar>
+          </w:tcPr>
+          <w:p>
+            <w:r>
+              <w:rPr>
+                <w:rFonts w:ascii="Arial" w:cs="Arial" w:eastAsia="Arial" w:hAnsi="Arial"/>
+                <w:color w:val="222222"/>
+                <w:sz w:val="18"/>
+                <w:szCs w:val="18"/>
+              </w:rPr>
+              <w:t xml:space="preserve">Grainy / noisy</w:t>
+            </w:r>
+          </w:p>
+        </w:tc>
+        <w:tc>
+          <w:tcPr>
+            <w:tcW w:type="dxa" w:w="4680"/>
+            <w:tcBorders>
+              <w:top w:val="single" w:color="CCCCCC" w:sz="1"/>
+              <w:left w:val="single" w:color="CCCCCC" w:sz="1"/>
+              <w:bottom w:val="single" w:color="CCCCCC" w:sz="1"/>
+              <w:right w:val="single" w:color="CCCCCC" w:sz="1"/>
+            </w:tcBorders>
+            <w:shd w:fill="F5FAFA" w:val="clear"/>
+            <w:tcMar>
+              <w:top w:type="dxa" w:w="80"/>
+              <w:left w:type="dxa" w:w="120"/>
+              <w:bottom w:type="dxa" w:w="80"/>
+              <w:right w:type="dxa" w:w="120"/>
+            </w:tcMar>
+          </w:tcPr>
+          <w:p>
+            <w:r>
+              <w:rPr>
+                <w:rFonts w:ascii="Arial" w:cs="Arial" w:eastAsia="Arial" w:hAnsi="Arial"/>
+                <w:color w:val="222222"/>
+                <w:sz w:val="18"/>
+                <w:szCs w:val="18"/>
+              </w:rPr>
+              <w:t xml:space="preserve">Lower ISO, increase shutter to compensate</w:t>
+            </w:r>
+          </w:p>
+        </w:tc>
+      </w:tr>
+      <w:tr>
+        <w:tc>
+          <w:tcPr>
+            <w:tcW w:type="dxa" w:w="4680"/>
+            <w:tcBorders>
+              <w:top w:val="single" w:color="CCCCCC" w:sz="1"/>
+              <w:left w:val="single" w:color="CCCCCC" w:sz="1"/>
+              <w:bottom w:val="single" w:color="CCCCCC" w:sz="1"/>
+              <w:right w:val="single" w:color="CCCCCC" w:sz="1"/>
+            </w:tcBorders>
+            <w:shd w:fill="FFFFFF" w:val="clear"/>
+            <w:tcMar>
+              <w:top w:type="dxa" w:w="80"/>
+              <w:left w:type="dxa" w:w="120"/>
+              <w:bottom w:type="dxa" w:w="80"/>
+              <w:right w:type="dxa" w:w="120"/>
+            </w:tcMar>
+          </w:tcPr>
+          <w:p>
+            <w:r>
+              <w:rPr>
+                <w:rFonts w:ascii="Arial" w:cs="Arial" w:eastAsia="Arial" w:hAnsi="Arial"/>
+                <w:color w:val="222222"/>
+                <w:sz w:val="18"/>
+                <w:szCs w:val="18"/>
+              </w:rPr>
+              <w:t xml:space="preserve">Aurora smeared</w:t>
+            </w:r>
+          </w:p>
+        </w:tc>
+        <w:tc>
+          <w:tcPr>
+            <w:tcW w:type="dxa" w:w="4680"/>
+            <w:tcBorders>
+              <w:top w:val="single" w:color="CCCCCC" w:sz="1"/>
+              <w:left w:val="single" w:color="CCCCCC" w:sz="1"/>
+              <w:bottom w:val="single" w:color="CCCCCC" w:sz="1"/>
+              <w:right w:val="single" w:color="CCCCCC" w:sz="1"/>
+            </w:tcBorders>
+            <w:shd w:fill="FFFFFF" w:val="clear"/>
+            <w:tcMar>
+              <w:top w:type="dxa" w:w="80"/>
+              <w:left w:type="dxa" w:w="120"/>
+              <w:bottom w:type="dxa" w:w="80"/>
+              <w:right w:type="dxa" w:w="120"/>
+            </w:tcMar>
+          </w:tcPr>
+          <w:p>
+            <w:r>
+              <w:rPr>
+                <w:rFonts w:ascii="Arial" w:cs="Arial" w:eastAsia="Arial" w:hAnsi="Arial"/>
+                <w:color w:val="222222"/>
+                <w:sz w:val="18"/>
+                <w:szCs w:val="18"/>
+              </w:rPr>
+              <w:t xml:space="preserve">Shorten shutter — aurora moving faster than exposure</w:t>
+            </w:r>
+          </w:p>
+        </w:tc>
+      </w:tr>
+      <w:tr>
+        <w:tc>
+          <w:tcPr>
+            <w:tcW w:type="dxa" w:w="4680"/>
+            <w:tcBorders>
+              <w:top w:val="single" w:color="CCCCCC" w:sz="1"/>
+              <w:left w:val="single" w:color="CCCCCC" w:sz="1"/>
+              <w:bottom w:val="single" w:color="CCCCCC" w:sz="1"/>
+              <w:right w:val="single" w:color="CCCCCC" w:sz="1"/>
+            </w:tcBorders>
+            <w:shd w:fill="F5FAFA" w:val="clear"/>
+            <w:tcMar>
+              <w:top w:type="dxa" w:w="80"/>
+              <w:left w:type="dxa" w:w="120"/>
+              <w:bottom w:type="dxa" w:w="80"/>
+              <w:right w:type="dxa" w:w="120"/>
+            </w:tcMar>
+          </w:tcPr>
+          <w:p>
+            <w:r>
+              <w:rPr>
+                <w:rFonts w:ascii="Arial" w:cs="Arial" w:eastAsia="Arial" w:hAnsi="Arial"/>
+                <w:color w:val="222222"/>
+                <w:sz w:val="18"/>
+                <w:szCs w:val="18"/>
+              </w:rPr>
+              <w:t xml:space="preserve">Everything blurry</w:t>
+            </w:r>
+          </w:p>
+        </w:tc>
+        <w:tc>
+          <w:tcPr>
+            <w:tcW w:type="dxa" w:w="4680"/>
+            <w:tcBorders>
+              <w:top w:val="single" w:color="CCCCCC" w:sz="1"/>
+              <w:left w:val="single" w:color="CCCCCC" w:sz="1"/>
+              <w:bottom w:val="single" w:color="CCCCCC" w:sz="1"/>
+              <w:right w:val="single" w:color="CCCCCC" w:sz="1"/>
+            </w:tcBorders>
+            <w:shd w:fill="F5FAFA" w:val="clear"/>
+            <w:tcMar>
+              <w:top w:type="dxa" w:w="80"/>
+              <w:left w:type="dxa" w:w="120"/>
+              <w:bottom w:type="dxa" w:w="80"/>
+              <w:right w:type="dxa" w:w="120"/>
+            </w:tcMar>
+          </w:tcPr>
+          <w:p>
+            <w:r>
+              <w:rPr>
+                <w:rFonts w:ascii="Arial" w:cs="Arial" w:eastAsia="Arial" w:hAnsi="Arial"/>
+                <w:color w:val="222222"/>
+                <w:sz w:val="18"/>
+                <w:szCs w:val="18"/>
+              </w:rPr>
+              <w:t xml:space="preserve">Camera shake — use 2s timer, check tripod</w:t>
+            </w:r>
+          </w:p>
+        </w:tc>
+      </w:tr>
+      <w:tr>
+        <w:tc>
+          <w:tcPr>
+            <w:tcW w:type="dxa" w:w="4680"/>
+            <w:tcBorders>
+              <w:top w:val="single" w:color="CCCCCC" w:sz="1"/>
+              <w:left w:val="single" w:color="CCCCCC" w:sz="1"/>
+              <w:bottom w:val="single" w:color="CCCCCC" w:sz="1"/>
+              <w:right w:val="single" w:color="CCCCCC" w:sz="1"/>
+            </w:tcBorders>
+            <w:shd w:fill="FFFFFF" w:val="clear"/>
+            <w:tcMar>
+              <w:top w:type="dxa" w:w="80"/>
+              <w:left w:type="dxa" w:w="120"/>
+              <w:bottom w:type="dxa" w:w="80"/>
+              <w:right w:type="dxa" w:w="120"/>
+            </w:tcMar>
+          </w:tcPr>
+          <w:p>
+            <w:r>
+              <w:rPr>
+                <w:rFonts w:ascii="Arial" w:cs="Arial" w:eastAsia="Arial" w:hAnsi="Arial"/>
+                <w:color w:val="222222"/>
+                <w:sz w:val="18"/>
+                <w:szCs w:val="18"/>
+              </w:rPr>
+              <w:t xml:space="preserve">Stars trailing</w:t>
+            </w:r>
+          </w:p>
+        </w:tc>
+        <w:tc>
+          <w:tcPr>
+            <w:tcW w:type="dxa" w:w="4680"/>
+            <w:tcBorders>
+              <w:top w:val="single" w:color="CCCCCC" w:sz="1"/>
+              <w:left w:val="single" w:color="CCCCCC" w:sz="1"/>
+              <w:bottom w:val="single" w:color="CCCCCC" w:sz="1"/>
+              <w:right w:val="single" w:color="CCCCCC" w:sz="1"/>
+            </w:tcBorders>
+            <w:shd w:fill="FFFFFF" w:val="clear"/>
+            <w:tcMar>
+              <w:top w:type="dxa" w:w="80"/>
+              <w:left w:type="dxa" w:w="120"/>
+              <w:bottom w:type="dxa" w:w="80"/>
+              <w:right w:type="dxa" w:w="120"/>
+            </w:tcMar>
+          </w:tcPr>
+          <w:p>
+            <w:r>
+              <w:rPr>
+                <w:rFonts w:ascii="Arial" w:cs="Arial" w:eastAsia="Arial" w:hAnsi="Arial"/>
+                <w:color w:val="222222"/>
+                <w:sz w:val="18"/>
+                <w:szCs w:val="18"/>
+              </w:rPr>
+              <w:t xml:space="preserve">Shorten shutter to NPF limit for your focal length</w:t>
+            </w:r>
+          </w:p>
+        </w:tc>
+      </w:tr>
+      <w:tr>
+        <w:tc>
+          <w:tcPr>
+            <w:tcW w:type="dxa" w:w="4680"/>
+            <w:tcBorders>
+              <w:top w:val="single" w:color="CCCCCC" w:sz="1"/>
+              <w:left w:val="single" w:color="CCCCCC" w:sz="1"/>
+              <w:bottom w:val="single" w:color="CCCCCC" w:sz="1"/>
+              <w:right w:val="single" w:color="CCCCCC" w:sz="1"/>
+            </w:tcBorders>
+            <w:shd w:fill="F5FAFA" w:val="clear"/>
+            <w:tcMar>
+              <w:top w:type="dxa" w:w="80"/>
+              <w:left w:type="dxa" w:w="120"/>
+              <w:bottom w:type="dxa" w:w="80"/>
+              <w:right w:type="dxa" w:w="120"/>
+            </w:tcMar>
+          </w:tcPr>
+          <w:p>
+            <w:r>
+              <w:rPr>
+                <w:rFonts w:ascii="Arial" w:cs="Arial" w:eastAsia="Arial" w:hAnsi="Arial"/>
+                <w:color w:val="222222"/>
+                <w:sz w:val="18"/>
+                <w:szCs w:val="18"/>
+              </w:rPr>
+              <w:t xml:space="preserve">Aurora blurry, stars sharp</w:t>
+            </w:r>
+          </w:p>
+        </w:tc>
+        <w:tc>
+          <w:tcPr>
+            <w:tcW w:type="dxa" w:w="4680"/>
+            <w:tcBorders>
+              <w:top w:val="single" w:color="CCCCCC" w:sz="1"/>
+              <w:left w:val="single" w:color="CCCCCC" w:sz="1"/>
+              <w:bottom w:val="single" w:color="CCCCCC" w:sz="1"/>
+              <w:right w:val="single" w:color="CCCCCC" w:sz="1"/>
+            </w:tcBorders>
+            <w:shd w:fill="F5FAFA" w:val="clear"/>
+            <w:tcMar>
+              <w:top w:type="dxa" w:w="80"/>
+              <w:left w:type="dxa" w:w="120"/>
+              <w:bottom w:type="dxa" w:w="80"/>
+              <w:right w:type="dxa" w:w="120"/>
+            </w:tcMar>
+          </w:tcPr>
+          <w:p>
+            <w:r>
+              <w:rPr>
+                <w:rFonts w:ascii="Arial" w:cs="Arial" w:eastAsia="Arial" w:hAnsi="Arial"/>
+                <w:color w:val="222222"/>
+                <w:sz w:val="18"/>
+                <w:szCs w:val="18"/>
+              </w:rPr>
+              <w:t xml:space="preserve">Aurora motion — shorten shutter</w:t>
+            </w:r>
+          </w:p>
+        </w:tc>
+      </w:tr>
+      <w:tr>
+        <w:tc>
+          <w:tcPr>
+            <w:tcW w:type="dxa" w:w="4680"/>
+            <w:tcBorders>
+              <w:top w:val="single" w:color="CCCCCC" w:sz="1"/>
+              <w:left w:val="single" w:color="CCCCCC" w:sz="1"/>
+              <w:bottom w:val="single" w:color="CCCCCC" w:sz="1"/>
+              <w:right w:val="single" w:color="CCCCCC" w:sz="1"/>
+            </w:tcBorders>
+            <w:shd w:fill="FFFFFF" w:val="clear"/>
+            <w:tcMar>
+              <w:top w:type="dxa" w:w="80"/>
+              <w:left w:type="dxa" w:w="120"/>
+              <w:bottom w:type="dxa" w:w="80"/>
+              <w:right w:type="dxa" w:w="120"/>
+            </w:tcMar>
+          </w:tcPr>
+          <w:p>
+            <w:r>
+              <w:rPr>
+                <w:rFonts w:ascii="Arial" w:cs="Arial" w:eastAsia="Arial" w:hAnsi="Arial"/>
+                <w:color w:val="222222"/>
+                <w:sz w:val="18"/>
+                <w:szCs w:val="18"/>
+              </w:rPr>
+              <w:t xml:space="preserve">Focus soft</w:t>
+            </w:r>
+          </w:p>
+        </w:tc>
+        <w:tc>
+          <w:tcPr>
+            <w:tcW w:type="dxa" w:w="4680"/>
+            <w:tcBorders>
+              <w:top w:val="single" w:color="CCCCCC" w:sz="1"/>
+              <w:left w:val="single" w:color="CCCCCC" w:sz="1"/>
+              <w:bottom w:val="single" w:color="CCCCCC" w:sz="1"/>
+              <w:right w:val="single" w:color="CCCCCC" w:sz="1"/>
+            </w:tcBorders>
+            <w:shd w:fill="FFFFFF" w:val="clear"/>
+            <w:tcMar>
+              <w:top w:type="dxa" w:w="80"/>
+              <w:left w:type="dxa" w:w="120"/>
+              <w:bottom w:type="dxa" w:w="80"/>
+              <w:right w:type="dxa" w:w="120"/>
+            </w:tcMar>
+          </w:tcPr>
+          <w:p>
+            <w:r>
+              <w:rPr>
+                <w:rFonts w:ascii="Arial" w:cs="Arial" w:eastAsia="Arial" w:hAnsi="Arial"/>
+                <w:color w:val="222222"/>
+                <w:sz w:val="18"/>
+                <w:szCs w:val="18"/>
+              </w:rPr>
+              <w:t xml:space="preserve">Re-focus manually on a bright star</w:t>
+            </w:r>
+          </w:p>
+        </w:tc>
+      </w:tr>
+    </w:tbl>
+    <w:p>
+      <w:pPr>
+        <w:pBdr>
+          <w:bottom w:val="single" w:color="DDDDDD" w:sz="4"/>
+        </w:pBdr>
+        <w:spacing w:after="200" w:before="200"/>
+      </w:pPr>
+    </w:p>
+    <w:p>
+      <w:pPr>
+        <w:pStyle w:val="Heading1"/>
+        <w:spacing w:after="120" w:before="360"/>
+      </w:pPr>
+      <w:r>
+        <w:rPr>
+          <w:rFonts w:ascii="Arial" w:cs="Arial" w:eastAsia="Arial" w:hAnsi="Arial"/>
+          <w:b/>
+          <w:bCs/>
+          <w:color w:val="1A1A2E"/>
+          <w:sz w:val="32"/>
+          <w:szCs w:val="32"/>
+        </w:rPr>
+        <w:t xml:space="preserve">Admin Features</w:t>
+      </w:r>
+    </w:p>
+    <w:p>
+      <w:pPr>
+        <w:spacing w:after="80" w:before="60"/>
+      </w:pPr>
+      <w:r>
+        <w:rPr>
+          <w:rFonts w:ascii="Arial" w:cs="Arial" w:eastAsia="Arial" w:hAnsi="Arial"/>
+          <w:color w:val="222222"/>
+          <w:sz w:val="20"/>
+          <w:szCs w:val="20"/>
+        </w:rPr>
+        <w:t xml:space="preserve">Enter the admin passphrase in the bottom bar password field and tap GO. The QUEUE button appears.</w:t>
       </w:r>
     </w:p>
     <w:p>
@@ -2872,7 +3363,7 @@
           <w:sz w:val="24"/>
           <w:szCs w:val="24"/>
         </w:rPr>
-        <w:t xml:space="preserve">Deleting Sightings</w:t>
+        <w:t xml:space="preserve">Spots Tab</w:t>
       </w:r>
     </w:p>
     <w:p>
@@ -2882,13 +3373,135 @@
       <w:r>
         <w:rPr>
           <w:rFonts w:ascii="Arial" w:cs="Arial" w:eastAsia="Arial" w:hAnsi="Arial"/>
-          <w:b w:val="false"/>
-          <w:bCs w:val="false"/>
-          <w:color w:val="222222"/>
-          <w:sz w:val="20"/>
-          <w:szCs w:val="20"/>
-        </w:rPr>
-        <w:t xml:space="preserve">When admin is active, tapping inside a sighting ring shows a DELETE SIGHTING button in the popup. Tap to remove immediately.</w:t>
+          <w:color w:val="222222"/>
+          <w:sz w:val="20"/>
+          <w:szCs w:val="20"/>
+        </w:rPr>
+        <w:t xml:space="preserve">Pending location submissions. Each card shows the spot details with links to view on the app map, Apple Maps, and Google Maps. APPROVE adds the spot publicly. REJECT soft-deletes with a timestamp for audit history.</w:t>
+      </w:r>
+    </w:p>
+    <w:p>
+      <w:pPr>
+        <w:pStyle w:val="Heading2"/>
+        <w:spacing w:after="80" w:before="240"/>
+      </w:pPr>
+      <w:r>
+        <w:rPr>
+          <w:rFonts w:ascii="Arial" w:cs="Arial" w:eastAsia="Arial" w:hAnsi="Arial"/>
+          <w:b/>
+          <w:bCs/>
+          <w:color w:val="1A7A6E"/>
+          <w:sz w:val="24"/>
+          <w:szCs w:val="24"/>
+        </w:rPr>
+        <w:t xml:space="preserve">Photos Tab</w:t>
+      </w:r>
+    </w:p>
+    <w:p>
+      <w:pPr>
+        <w:spacing w:after="80" w:before="60"/>
+      </w:pPr>
+      <w:r>
+        <w:rPr>
+          <w:rFonts w:ascii="Arial" w:cs="Arial" w:eastAsia="Arial" w:hAnsi="Arial"/>
+          <w:color w:val="222222"/>
+          <w:sz w:val="20"/>
+          <w:szCs w:val="20"/>
+        </w:rPr>
+        <w:t xml:space="preserve">Pending photo submissions. APPROVE makes the photo public. REJECT removes it.</w:t>
+      </w:r>
+    </w:p>
+    <w:p>
+      <w:pPr>
+        <w:pStyle w:val="Heading2"/>
+        <w:spacing w:after="80" w:before="240"/>
+      </w:pPr>
+      <w:r>
+        <w:rPr>
+          <w:rFonts w:ascii="Arial" w:cs="Arial" w:eastAsia="Arial" w:hAnsi="Arial"/>
+          <w:b/>
+          <w:bCs/>
+          <w:color w:val="1A7A6E"/>
+          <w:sz w:val="24"/>
+          <w:szCs w:val="24"/>
+        </w:rPr>
+        <w:t xml:space="preserve">Flagged Tab</w:t>
+      </w:r>
+    </w:p>
+    <w:p>
+      <w:pPr>
+        <w:spacing w:after="80" w:before="60"/>
+      </w:pPr>
+      <w:r>
+        <w:rPr>
+          <w:rFonts w:ascii="Arial" w:cs="Arial" w:eastAsia="Arial" w:hAnsi="Arial"/>
+          <w:color w:val="222222"/>
+          <w:sz w:val="20"/>
+          <w:szCs w:val="20"/>
+        </w:rPr>
+        <w:t xml:space="preserve">Photos flagged by community members. DELETE permanently removes the photo. DISMISS clears the flag and leaves the photo published.</w:t>
+      </w:r>
+    </w:p>
+    <w:p>
+      <w:pPr>
+        <w:pStyle w:val="Heading2"/>
+        <w:spacing w:after="80" w:before="240"/>
+      </w:pPr>
+      <w:r>
+        <w:rPr>
+          <w:rFonts w:ascii="Arial" w:cs="Arial" w:eastAsia="Arial" w:hAnsi="Arial"/>
+          <w:b/>
+          <w:bCs/>
+          <w:color w:val="1A7A6E"/>
+          <w:sz w:val="24"/>
+          <w:szCs w:val="24"/>
+        </w:rPr>
+        <w:t xml:space="preserve">Sightings Tab</w:t>
+      </w:r>
+    </w:p>
+    <w:p>
+      <w:pPr>
+        <w:spacing w:after="80" w:before="60"/>
+      </w:pPr>
+      <w:r>
+        <w:rPr>
+          <w:rFonts w:ascii="Arial" w:cs="Arial" w:eastAsia="Arial" w:hAnsi="Arial"/>
+          <w:color w:val="222222"/>
+          <w:sz w:val="20"/>
+          <w:szCs w:val="20"/>
+        </w:rPr>
+        <w:t xml:space="preserve">Sighting removal requests submitted by users who cannot undo from their original device. Each card shows the sighting details and the user's reason. DELETE (with confirmation) permanently removes the sighting. DISMISS (with confirmation) clears the request and leaves the sighting on the map.</w:t>
+      </w:r>
+    </w:p>
+    <w:p>
+      <w:pPr>
+        <w:pStyle w:val="Heading2"/>
+        <w:spacing w:after="80" w:before="240"/>
+      </w:pPr>
+      <w:r>
+        <w:rPr>
+          <w:rFonts w:ascii="Arial" w:cs="Arial" w:eastAsia="Arial" w:hAnsi="Arial"/>
+          <w:b/>
+          <w:bCs/>
+          <w:color w:val="1A7A6E"/>
+          <w:sz w:val="24"/>
+          <w:szCs w:val="24"/>
+        </w:rPr>
+        <w:t xml:space="preserve">Deleting Sightings from the Map</w:t>
+      </w:r>
+    </w:p>
+    <w:p>
+      <w:pPr>
+        <w:spacing w:after="80" w:before="60"/>
+      </w:pPr>
+      <w:r>
+        <w:rPr>
+          <w:rFonts w:ascii="Arial" w:cs="Arial" w:eastAsia="Arial" w:hAnsi="Arial"/>
+          <w:color w:val="222222"/>
+          <w:sz w:val="20"/>
+          <w:szCs w:val="20"/>
+        </w:rPr>
+        <w:t xml:space="preserve">When admin is active, tapping any sighting ring shows an ADMIN DELETE button in the popup. Tap it and confirm to remove immediately.</w:t>
       </w:r>
     </w:p>
     <w:p>
@@ -2913,7 +3526,7 @@
           <w:sz w:val="32"/>
           <w:szCs w:val="32"/>
         </w:rPr>
-        <w:t xml:space="preserve">Troubleshooting</w:t>
+        <w:t xml:space="preserve">Troubleshooting the App</w:t>
       </w:r>
     </w:p>
     <w:tbl>
@@ -3261,7 +3874,7 @@
                 <w:sz w:val="18"/>
                 <w:szCs w:val="18"/>
               </w:rPr>
-              <w:t xml:space="preserve">Supabase connection failed</w:t>
+              <w:t xml:space="preserve">Supabase connection failed or rejected column missing</w:t>
             </w:r>
           </w:p>
         </w:tc>
@@ -3290,7 +3903,7 @@
                 <w:sz w:val="18"/>
                 <w:szCs w:val="18"/>
               </w:rPr>
-              <w:t xml:space="preserve">Reload — falls back to local data</w:t>
+              <w:t xml:space="preserve">Run database migration SQL, then reload</w:t>
             </w:r>
           </w:p>
         </w:tc>
@@ -3410,7 +4023,7 @@
                 <w:sz w:val="18"/>
                 <w:szCs w:val="18"/>
               </w:rPr>
-              <w:t xml:space="preserve">G badge shows wrong level</w:t>
+              <w:t xml:space="preserve">Camera advisor shows Bortle 5 in arctic</w:t>
             </w:r>
           </w:p>
         </w:tc>
@@ -3439,7 +4052,7 @@
                 <w:sz w:val="18"/>
                 <w:szCs w:val="18"/>
               </w:rPr>
-              <w:t xml:space="preserve">Stale pipeline data</w:t>
+              <w:t xml:space="preserve">Outside grid coverage</w:t>
             </w:r>
           </w:p>
         </w:tc>
@@ -3468,7 +4081,7 @@
                 <w:sz w:val="18"/>
                 <w:szCs w:val="18"/>
               </w:rPr>
-              <w:t xml:space="preserve">Trigger space weather workflow from Actions tab</w:t>
+              <w:t xml:space="preserve">Use the override toggle to set Bortle manually</w:t>
             </w:r>
           </w:p>
         </w:tc>
@@ -3499,7 +4112,7 @@
                 <w:sz w:val="18"/>
                 <w:szCs w:val="18"/>
               </w:rPr>
-              <w:t xml:space="preserve">Header clipped on iPhone</w:t>
+              <w:t xml:space="preserve">Sighting rings jump on pan</w:t>
             </w:r>
           </w:p>
         </w:tc>
@@ -3528,7 +4141,7 @@
                 <w:sz w:val="18"/>
                 <w:szCs w:val="18"/>
               </w:rPr>
-              <w:t xml:space="preserve">Safe area not respected</w:t>
+              <w:t xml:space="preserve">Canvas positioning issue</w:t>
             </w:r>
           </w:p>
         </w:tc>
@@ -3557,7 +4170,7 @@
                 <w:sz w:val="18"/>
                 <w:szCs w:val="18"/>
               </w:rPr>
-              <w:t xml:space="preserve">Use Add to Home Screen for full-screen mode</w:t>
+              <w:t xml:space="preserve">Hard refresh (Ctrl+Shift+R)</w:t>
             </w:r>
           </w:p>
         </w:tc>
@@ -3595,8 +4208,6 @@
       <w:r>
         <w:rPr>
           <w:rFonts w:ascii="Arial" w:cs="Arial" w:eastAsia="Arial" w:hAnsi="Arial"/>
-          <w:b w:val="false"/>
-          <w:bCs w:val="false"/>
           <w:color w:val="222222"/>
           <w:sz w:val="20"/>
           <w:szCs w:val="20"/>
@@ -3611,8 +4222,6 @@
       <w:r>
         <w:rPr>
           <w:rFonts w:ascii="Arial" w:cs="Arial" w:eastAsia="Arial" w:hAnsi="Arial"/>
-          <w:b w:val="false"/>
-          <w:bCs w:val="false"/>
           <w:color w:val="222222"/>
           <w:sz w:val="20"/>
           <w:szCs w:val="20"/>

</xml_diff>

<commit_message>
update handbook and quickstart docs
</commit_message>
<xml_diff>
--- a/documents/NightWatch_Handbook.docx
+++ b/documents/NightWatch_Handbook.docx
@@ -85,21 +85,7 @@
           <w:sz w:val="20"/>
           <w:szCs w:val="20"/>
         </w:rPr>
-        <w:t xml:space="preserve">Night Watch is a real-time aurora hunting application built for the northeastern United States and southeastern Canada. It combines space weather data, cloud cover forecasts, light pollution mapping, community spot submissions, aurora photos, and live sighting reports on a single interactive map.</w:t>
-      </w:r>
-    </w:p>
-    <w:p>
-      <w:pPr>
-        <w:spacing w:after="80" w:before="60"/>
-      </w:pPr>
-      <w:r>
-        <w:rPr>
-          <w:rFonts w:ascii="Arial" w:cs="Arial" w:eastAsia="Arial" w:hAnsi="Arial"/>
-          <w:color w:val="222222"/>
-          <w:sz w:val="20"/>
-          <w:szCs w:val="20"/>
-        </w:rPr>
-        <w:t xml:space="preserve">This handbook covers every feature in detail.</w:t>
+        <w:t xml:space="preserve">Night Watch is a real-time aurora hunting application built for the northeastern United States and southeastern Canada. It combines space weather data, cloud cover forecasts, light pollution mapping, community spot submissions, aurora photos, live webcams, and live sighting reports on a single interactive map.</w:t>
       </w:r>
     </w:p>
     <w:p>
@@ -155,27 +141,7 @@
           <w:sz w:val="20"/>
           <w:szCs w:val="20"/>
         </w:rPr>
-        <w:t xml:space="preserve">Night Watch is a private app for the Substorm Society community. Enter the passphrase shared via Telegram when you first open the app. It is stored in your browser — you will not need to re-enter it on the same device.</w:t>
-      </w:r>
-    </w:p>
-    <w:p>
-      <w:pPr>
-        <w:pBdr>
-          <w:left w:val="single" w:color="1A7A6E" w:sz="4"/>
-        </w:pBdr>
-        <w:spacing w:after="80" w:before="80"/>
-        <w:ind w:left="360"/>
-      </w:pPr>
-      <w:r>
-        <w:rPr>
-          <w:rFonts w:ascii="Arial" w:cs="Arial" w:eastAsia="Arial" w:hAnsi="Arial"/>
-          <w:i/>
-          <w:iCs/>
-          <w:color w:val="445566"/>
-          <w:sz w:val="18"/>
-          <w:szCs w:val="18"/>
-        </w:rPr>
-        <w:t xml:space="preserve">The passphrase is rotated periodically. If the app asks you to re-enter it, check the Telegram group for the current one.</w:t>
+        <w:t xml:space="preserve">Night Watch is a private app for the Substorm Society community. Enter the passphrase shared via Telegram when you first open the app. It is stored in your browser so you will not need to re-enter it on the same device.</w:t>
       </w:r>
     </w:p>
     <w:p>
@@ -286,7 +252,7 @@
           <w:sz w:val="20"/>
           <w:szCs w:val="20"/>
         </w:rPr>
-        <w:t xml:space="preserve">The panel at the top updates every 30–60 minutes. It shows the aurora intensity image, moon phase, current Bz, and the stats panel.</w:t>
+        <w:t xml:space="preserve">The panel at the top updates every 30-60 minutes. It shows the aurora intensity image, moon phase, current Bz, and the stats panel.</w:t>
       </w:r>
     </w:p>
     <w:p>
@@ -321,26 +287,6 @@
     </w:p>
     <w:p>
       <w:pPr>
-        <w:pBdr>
-          <w:left w:val="single" w:color="1A7A6E" w:sz="4"/>
-        </w:pBdr>
-        <w:spacing w:after="80" w:before="80"/>
-        <w:ind w:left="360"/>
-      </w:pPr>
-      <w:r>
-        <w:rPr>
-          <w:rFonts w:ascii="Arial" w:cs="Arial" w:eastAsia="Arial" w:hAnsi="Arial"/>
-          <w:i/>
-          <w:iCs/>
-          <w:color w:val="445566"/>
-          <w:sz w:val="18"/>
-          <w:szCs w:val="18"/>
-        </w:rPr>
-        <w:t xml:space="preserve">Bz is measured at the L1 point about 1.5 million km sunward of Earth. It takes 30–60 minutes to reach Earth depending on solar wind speed.</w:t>
-      </w:r>
-    </w:p>
-    <w:p>
-      <w:pPr>
         <w:spacing w:after="60" w:before="160"/>
       </w:pPr>
       <w:r>
@@ -366,7 +312,7 @@
           <w:sz w:val="20"/>
           <w:szCs w:val="20"/>
         </w:rPr>
-        <w:t xml:space="preserve">Three rows: Intensity (aurora label Calm through Extreme), Interference (moon effect on viewing, 0 when moon is down), Astro Dark (percentage of full astronomical darkness). The Chase Quality label summarizes all three.</w:t>
+        <w:t xml:space="preserve">Three rows: Intensity (Calm through Extreme), Interference (moon effect, 0 when moon is down), Astro Dark (percentage of full astronomical darkness). The Chase Quality label summarizes all three.</w:t>
       </w:r>
     </w:p>
     <w:p>
@@ -397,7 +343,7 @@
           <w:sz w:val="20"/>
           <w:szCs w:val="20"/>
         </w:rPr>
-        <w:t xml:space="preserve">The interactive timeline spans 1 hour past to 8 hours future. Tap to jump to any hour. Shows: Bz trace (red = southward, green = northward), V and n plasma traces, sun/moon shading, moonrise/set and sunrise/set markers, L1 propagation lag line, and a selected-hour box (white at NOW, red for future hours).</w:t>
+        <w:t xml:space="preserve">The interactive timeline spans 1 hour past to 8 hours future. Tap to jump to any hour. Shows: Bz trace, V and n plasma traces, sun/moon shading, moonrise/set and sunrise/set markers, L1 propagation lag line, and a selected-hour box.</w:t>
       </w:r>
     </w:p>
     <w:p>
@@ -459,7 +405,7 @@
           <w:sz w:val="20"/>
           <w:szCs w:val="20"/>
         </w:rPr>
-        <w:t xml:space="preserve">G badge shows current geomagnetic storm level derived from Kp. Updates per selected forecast hour when scrubbing. HSS badge shows High Speed Stream status — ACTIVE when solar wind speed is above 450 km/s with a fresh NOAA alert.</w:t>
+        <w:t xml:space="preserve">G badge shows current geomagnetic storm level. HSS badge shows High Speed Stream status — ACTIVE when solar wind speed exceeds 450 km/s.</w:t>
       </w:r>
     </w:p>
     <w:tbl>
@@ -1148,7 +1094,7 @@
           <w:sz w:val="24"/>
           <w:szCs w:val="24"/>
         </w:rPr>
-        <w:t xml:space="preserve">Search (🔍)</w:t>
+        <w:t xml:space="preserve">Search (magnifying glass)</w:t>
       </w:r>
     </w:p>
     <w:p>
@@ -1162,7 +1108,7 @@
           <w:sz w:val="20"/>
           <w:szCs w:val="20"/>
         </w:rPr>
-        <w:t xml:space="preserve">Magnifying glass top-left of the map. Powered by Nominatim / OpenStreetMap. Search any city, town, park, or address in the US or Canada. Tap a result to fly the map there. Searching Peru, NY triggers a special mode.</w:t>
+        <w:t xml:space="preserve">Top-left of the map. Search any city, town, park, or address. Searching Peru, NY triggers a special mode.</w:t>
       </w:r>
     </w:p>
     <w:p>
@@ -1179,7 +1125,7 @@
           <w:sz w:val="24"/>
           <w:szCs w:val="24"/>
         </w:rPr>
-        <w:t xml:space="preserve">Night Vision Mode (🌙)</w:t>
+        <w:t xml:space="preserve">Night Vision Mode (moon icon)</w:t>
       </w:r>
     </w:p>
     <w:p>
@@ -1193,7 +1139,7 @@
           <w:sz w:val="20"/>
           <w:szCs w:val="20"/>
         </w:rPr>
-        <w:t xml:space="preserve">Crescent moon button below search. Toggles a deep red/black CSS filter over the entire app to preserve dark-adapted vision in the field. Defaults off every time the app opens.</w:t>
+        <w:t xml:space="preserve">Toggles a deep red/black filter over the entire app to preserve dark-adapted vision in the field. Defaults off every time the app opens.</w:t>
       </w:r>
     </w:p>
     <w:p>
@@ -1210,7 +1156,7 @@
           <w:sz w:val="24"/>
           <w:szCs w:val="24"/>
         </w:rPr>
-        <w:t xml:space="preserve">Camera Settings Advisor (📷)</w:t>
+        <w:t xml:space="preserve">Camera Settings Advisor (camera icon)</w:t>
       </w:r>
     </w:p>
     <w:p>
@@ -1224,7 +1170,80 @@
           <w:sz w:val="20"/>
           <w:szCs w:val="20"/>
         </w:rPr>
-        <w:t xml:space="preserve">Camera button below the moon icon. Tap it, then tap anywhere on the map at your shooting location. A panel opens with location-aware recommended camera settings. See the Camera Settings Advisor section for full details.</w:t>
+        <w:t xml:space="preserve">Tap the camera button, then tap anywhere on the map at your shooting location. A panel opens with recommended settings for your exact device and conditions. See the Camera Settings Advisor section for full details.</w:t>
+      </w:r>
+    </w:p>
+    <w:p>
+      <w:pPr>
+        <w:pStyle w:val="Heading2"/>
+        <w:spacing w:after="80" w:before="240"/>
+      </w:pPr>
+      <w:r>
+        <w:rPr>
+          <w:rFonts w:ascii="Arial" w:cs="Arial" w:eastAsia="Arial" w:hAnsi="Arial"/>
+          <w:b/>
+          <w:bCs/>
+          <w:color w:val="1A7A6E"/>
+          <w:sz w:val="24"/>
+          <w:szCs w:val="24"/>
+        </w:rPr>
+        <w:t xml:space="preserve">Clear Sky Finder (cloud icon)</w:t>
+      </w:r>
+    </w:p>
+    <w:p>
+      <w:pPr>
+        <w:spacing w:after="80" w:before="60"/>
+      </w:pPr>
+      <w:r>
+        <w:rPr>
+          <w:rFonts w:ascii="Arial" w:cs="Arial" w:eastAsia="Arial" w:hAnsi="Arial"/>
+          <w:color w:val="222222"/>
+          <w:sz w:val="20"/>
+          <w:szCs w:val="20"/>
+        </w:rPr>
+        <w:t xml:space="preserve">Tap the cloud button to activate Clear Sky Finder mode. A teal heatmap overlay appears showing which areas have the clearest skies averaged across the next 8 hours. Teal = best opportunities, fading to transparent = increasing cloud coverage.</w:t>
+      </w:r>
+    </w:p>
+    <w:p>
+      <w:pPr>
+        <w:spacing w:after="80" w:before="60"/>
+      </w:pPr>
+      <w:r>
+        <w:rPr>
+          <w:rFonts w:ascii="Arial" w:cs="Arial" w:eastAsia="Arial" w:hAnsi="Arial"/>
+          <w:color w:val="222222"/>
+          <w:sz w:val="20"/>
+          <w:szCs w:val="20"/>
+        </w:rPr>
+        <w:t xml:space="preserve">When Clear Sky Finder is activated, the Clouds and Bortle layers are automatically turned off to reduce visual clutter. You can re-enable them manually without exiting Clear Sky Finder mode.</w:t>
+      </w:r>
+    </w:p>
+    <w:p>
+      <w:pPr>
+        <w:spacing w:after="80" w:before="60"/>
+      </w:pPr>
+      <w:r>
+        <w:rPr>
+          <w:rFonts w:ascii="Arial" w:cs="Arial" w:eastAsia="Arial" w:hAnsi="Arial"/>
+          <w:color w:val="222222"/>
+          <w:sz w:val="20"/>
+          <w:szCs w:val="20"/>
+        </w:rPr>
+        <w:t xml:space="preserve">The spot pins switch to a cloud-only color mode in this state: teal pins indicate spots with consistently clear skies over the 8-hour window, while red pins indicate spots that are mostly clouded in. This is independent of Bortle class — the sole factor is cloud coverage.</w:t>
+      </w:r>
+    </w:p>
+    <w:p>
+      <w:pPr>
+        <w:spacing w:after="80" w:before="60"/>
+      </w:pPr>
+      <w:r>
+        <w:rPr>
+          <w:rFonts w:ascii="Arial" w:cs="Arial" w:eastAsia="Arial" w:hAnsi="Arial"/>
+          <w:color w:val="222222"/>
+          <w:sz w:val="20"/>
+          <w:szCs w:val="20"/>
+        </w:rPr>
+        <w:t xml:space="preserve">Clear Sky Finder is intentionally designed to pair with the Clouds layer. Turning both on simultaneously lets you compare the 8-hour average opportunity zones (teal heatmap) against the current hourly cloud snapshot (red overlay) as you scrub the time slider. The teal color is distinct from the red cloud layer so both can be read independently on the same map. Teal = where you have a good window. Red = what is actively in the way right now.</w:t>
       </w:r>
     </w:p>
     <w:p>
@@ -1280,7 +1299,7 @@
           <w:sz w:val="20"/>
           <w:szCs w:val="20"/>
         </w:rPr>
-        <w:t xml:space="preserve">HRRR cloud cover forecast. Transparent = clear sky. Red = overcast. Areas below 10% cloud cover are transparent; 10–30% fade in gradually; above 30% renders at full opacity scaled to cloud amount. On by default.</w:t>
+        <w:t xml:space="preserve">HRRR cloud cover forecast for the selected time slider hour. Transparent = clear sky. Red = overcast. On by default.</w:t>
       </w:r>
     </w:p>
     <w:p>
@@ -1311,21 +1330,7 @@
           <w:sz w:val="20"/>
           <w:szCs w:val="20"/>
         </w:rPr>
-        <w:t xml:space="preserve">NASA GIBS VIIRS night light tiles. Transparent = dark sky. Orange/red = light polluted. On by default.</w:t>
-      </w:r>
-    </w:p>
-    <w:p>
-      <w:pPr>
-        <w:spacing w:after="80" w:before="60"/>
-      </w:pPr>
-      <w:r>
-        <w:rPr>
-          <w:rFonts w:ascii="Arial" w:cs="Arial" w:eastAsia="Arial" w:hAnsi="Arial"/>
-          <w:color w:val="222222"/>
-          <w:sz w:val="20"/>
-          <w:szCs w:val="20"/>
-        </w:rPr>
-        <w:t xml:space="preserve">When both Clouds and Bortle are active, they render as a combined overlay — light pollution tiles with cloud cover on top. Toggle either off independently to isolate clouds-only or bortle-only view.</w:t>
+        <w:t xml:space="preserve">NASA GIBS VIIRS night light tiles. Transparent = dark sky. Orange/red = light polluted. On by default. When both Clouds and Bortle are active they render as a combined overlay.</w:t>
       </w:r>
     </w:p>
     <w:p>
@@ -1356,7 +1361,7 @@
           <w:sz w:val="20"/>
           <w:szCs w:val="20"/>
         </w:rPr>
-        <w:t xml:space="preserve">NOAA Ovation Prime auroral oval. Solid teal = oval boundary (aurora overhead). Dashed teal = visibility limit (aurora on northern horizon). Always shows current conditions, does not update with the time slider.</w:t>
+        <w:t xml:space="preserve">NOAA Ovation Prime auroral oval. Solid teal = oval boundary. Dashed teal = visibility limit on northern horizon.</w:t>
       </w:r>
     </w:p>
     <w:p>
@@ -1387,7 +1392,7 @@
           <w:sz w:val="20"/>
           <w:szCs w:val="20"/>
         </w:rPr>
-        <w:t xml:space="preserve">Community dark sky spots as colored pins. Color = combined chase score for the selected hour. Red = poor, green = excellent. Tap any pin to open the spot card.</w:t>
+        <w:t xml:space="preserve">Community dark sky spots as uniformly-sized colored pins. In normal mode, color reflects the combined chase score for the selected hour. In Clear Sky Finder mode, color reflects 8-hour average cloud coverage only. Tap any pin to open the spot card.</w:t>
       </w:r>
     </w:p>
     <w:p>
@@ -1404,6 +1409,37 @@
           <w:sz w:val="24"/>
           <w:szCs w:val="24"/>
         </w:rPr>
+        <w:t xml:space="preserve">Live Cams</w:t>
+      </w:r>
+    </w:p>
+    <w:p>
+      <w:pPr>
+        <w:spacing w:after="80" w:before="60"/>
+      </w:pPr>
+      <w:r>
+        <w:rPr>
+          <w:rFonts w:ascii="Arial" w:cs="Arial" w:eastAsia="Arial" w:hAnsi="Arial"/>
+          <w:color w:val="222222"/>
+          <w:sz w:val="20"/>
+          <w:szCs w:val="20"/>
+        </w:rPr>
+        <w:t xml:space="preserve">Aurora webcam markers. When toggled on the map zooms to show the full camera network. Tap any marker for a refreshing snapshot and Watch Live button.</w:t>
+      </w:r>
+    </w:p>
+    <w:p>
+      <w:pPr>
+        <w:pStyle w:val="Heading2"/>
+        <w:spacing w:after="80" w:before="240"/>
+      </w:pPr>
+      <w:r>
+        <w:rPr>
+          <w:rFonts w:ascii="Arial" w:cs="Arial" w:eastAsia="Arial" w:hAnsi="Arial"/>
+          <w:b/>
+          <w:bCs/>
+          <w:color w:val="1A7A6E"/>
+          <w:sz w:val="24"/>
+          <w:szCs w:val="24"/>
+        </w:rPr>
         <w:t xml:space="preserve">Active Hunt</w:t>
       </w:r>
     </w:p>
@@ -1418,7 +1454,7 @@
           <w:sz w:val="20"/>
           <w:szCs w:val="20"/>
         </w:rPr>
-        <w:t xml:space="preserve">Live aurora sighting reports as fading teal rings. Each ring is 30km radius. Fresh reports are brighter; older ones fade and disappear after 5 hours. Tap inside a ring to see details.</w:t>
+        <w:t xml:space="preserve">Live aurora sighting reports as fading teal rings. Each ring is 30km radius. Reports expire after 5 hours. Tap inside a ring to see details.</w:t>
       </w:r>
     </w:p>
     <w:p>
@@ -1488,7 +1524,7 @@
           <w:sz w:val="20"/>
           <w:szCs w:val="20"/>
         </w:rPr>
-        <w:t xml:space="preserve">View direction, Bortle class, horizon quality (stars), access notes, and coordinates. Two score boxes: LOCATION (permanent quality from Bortle + horizon) and CHASE NOW (live score including current cloud cover at this exact location).</w:t>
+        <w:t xml:space="preserve">View direction, Bortle class, horizon quality, access notes, street address if provided, and coordinates. Two score boxes: LOCATION (permanent quality) and CHASE NOW (live score including current cloud cover). Directions buttons open Apple Maps or Google Maps navigation directly to the spot.</w:t>
       </w:r>
     </w:p>
     <w:p>
@@ -1519,7 +1555,7 @@
           <w:sz w:val="20"/>
           <w:szCs w:val="20"/>
         </w:rPr>
-        <w:t xml:space="preserve">Cloud cover percentage at this exact location for the next 8 hours as a color-coded bar chart. Green = clear, amber = partly cloudy, red = overcast. Use this to identify windows of opportunity.</w:t>
+        <w:t xml:space="preserve">Cloud cover percentage at this exact location for the next 8 hours as a color-coded bar chart. Green = clear, amber = partly cloudy, red = overcast.</w:t>
       </w:r>
     </w:p>
     <w:p>
@@ -1550,7 +1586,7 @@
           <w:sz w:val="20"/>
           <w:szCs w:val="20"/>
         </w:rPr>
-        <w:t xml:space="preserve">Community aurora photos at this location. Each shows the photographer name and caption. Tap the flag icon to report inappropriate content to admin. Tap + SUBMIT A PHOTO to contribute.</w:t>
+        <w:t xml:space="preserve">Community aurora photos at this location. Tap the flag icon to report inappropriate content. Tap + SUBMIT A PHOTO to contribute.</w:t>
       </w:r>
     </w:p>
     <w:p>
@@ -1606,7 +1642,7 @@
           <w:sz w:val="20"/>
           <w:szCs w:val="20"/>
         </w:rPr>
-        <w:t xml:space="preserve">Tap + PLACE PIN in the bottom bar, tap the map at the location, fill in the form, and submit for admin review. All fields start blank — fill in what you know.</w:t>
+        <w:t xml:space="preserve">Tap + PLACE PIN — the cursor changes to a crosshair. Tap the map at your location, fill in the form, and submit for admin review.</w:t>
       </w:r>
     </w:p>
     <w:p>
@@ -1644,7 +1680,7 @@
           <w:sz w:val="20"/>
           <w:szCs w:val="20"/>
         </w:rPr>
-        <w:t xml:space="preserve">Bortle class — 1 (darkest) to 9 (city center). Check lightpollutionmap.info if unsure.</w:t>
+        <w:t xml:space="preserve">Bortle class — auto-detected from the bortle grid when coordinates are entered. Shows "auto" when detected. Tap OVERRIDE to change manually, RESET to restore the auto value.</w:t>
       </w:r>
     </w:p>
     <w:p>
@@ -1663,7 +1699,7 @@
           <w:sz w:val="20"/>
           <w:szCs w:val="20"/>
         </w:rPr>
-        <w:t xml:space="preserve">View direction — best compass direction for aurora viewing</w:t>
+        <w:t xml:space="preserve">Street address — optional, used for turn-by-turn directions from the spot card</w:t>
       </w:r>
     </w:p>
     <w:p>
@@ -1682,7 +1718,7 @@
           <w:sz w:val="20"/>
           <w:szCs w:val="20"/>
         </w:rPr>
-        <w:t xml:space="preserve">Horizon quality — 1 to 5 stars based on how unobstructed the northern horizon is</w:t>
+        <w:t xml:space="preserve">View direction — best compass direction for aurora viewing</w:t>
       </w:r>
     </w:p>
     <w:p>
@@ -1701,7 +1737,40 @@
           <w:sz w:val="20"/>
           <w:szCs w:val="20"/>
         </w:rPr>
+        <w:t xml:space="preserve">Horizon quality — 1 to 5 stars based on how unobstructed the northern horizon is</w:t>
+      </w:r>
+    </w:p>
+    <w:p>
+      <w:pPr>
+        <w:pStyle w:val="ListParagraph"/>
+        <w:numPr>
+          <w:ilvl w:val="0"/>
+          <w:numId w:val="2"/>
+        </w:numPr>
+        <w:spacing w:after="40" w:before="40"/>
+      </w:pPr>
+      <w:r>
+        <w:rPr>
+          <w:rFonts w:ascii="Arial" w:cs="Arial" w:eastAsia="Arial" w:hAnsi="Arial"/>
+          <w:color w:val="222222"/>
+          <w:sz w:val="20"/>
+          <w:szCs w:val="20"/>
+        </w:rPr>
         <w:t xml:space="preserve">Access notes — parking, restrictions, how to get there</w:t>
+      </w:r>
+    </w:p>
+    <w:p>
+      <w:pPr>
+        <w:spacing w:after="80" w:before="60"/>
+      </w:pPr>
+      <w:r>
+        <w:rPr>
+          <w:rFonts w:ascii="Arial" w:cs="Arial" w:eastAsia="Arial" w:hAnsi="Arial"/>
+          <w:color w:val="222222"/>
+          <w:sz w:val="20"/>
+          <w:szCs w:val="20"/>
+        </w:rPr>
+        <w:t xml:space="preserve">After submitting a spot you have the option to attach a photo at the same time. Tap SUBMIT PHOTO or SKIP.</w:t>
       </w:r>
     </w:p>
     <w:p>
@@ -1732,7 +1801,7 @@
           <w:sz w:val="20"/>
           <w:szCs w:val="20"/>
         </w:rPr>
-        <w:t xml:space="preserve">Open a spot card → Photos tab → + SUBMIT A PHOTO. Photos are automatically compressed if over 8MB. Optionally add your name and a caption. Photos appear after admin approval.</w:t>
+        <w:t xml:space="preserve">Open a spot card, go to the Photos tab, and tap + SUBMIT A PHOTO. Photos are compressed to under 8MB automatically. Optionally add your name and a caption.</w:t>
       </w:r>
     </w:p>
     <w:p>
@@ -1763,21 +1832,7 @@
           <w:sz w:val="20"/>
           <w:szCs w:val="20"/>
         </w:rPr>
-        <w:t xml:space="preserve">Tap 🌌 REPORT AURORA in the bottom bar. Your GPS location is pre-filled. Check the boxes for what you observe and tap CONFIRM SIGHTING.</w:t>
-      </w:r>
-    </w:p>
-    <w:p>
-      <w:pPr>
-        <w:spacing w:after="80" w:before="60"/>
-      </w:pPr>
-      <w:r>
-        <w:rPr>
-          <w:rFonts w:ascii="Arial" w:cs="Arial" w:eastAsia="Arial" w:hAnsi="Arial"/>
-          <w:color w:val="222222"/>
-          <w:sz w:val="20"/>
-          <w:szCs w:val="20"/>
-        </w:rPr>
-        <w:t xml:space="preserve">To report for someone else at a different location, tap "Pick different location on map" — the cursor changes to a crosshair and you tap the map at their location.</w:t>
+        <w:t xml:space="preserve">Tap REPORT AURORA. Your GPS location is pre-filled. Check the boxes for what you observe and tap CONFIRM SIGHTING. To report for someone at a different location, tap "Pick different location on map" and tap the map at their location.</w:t>
       </w:r>
     </w:p>
     <w:tbl>
@@ -2275,7 +2330,7 @@
                 <w:sz w:val="18"/>
                 <w:szCs w:val="18"/>
               </w:rPr>
-              <w:t xml:space="preserve">Red coloration (higher altitude, stronger activity)</w:t>
+              <w:t xml:space="preserve">Red coloration (stronger activity)</w:t>
             </w:r>
           </w:p>
         </w:tc>
@@ -2429,21 +2484,7 @@
           <w:sz w:val="20"/>
           <w:szCs w:val="20"/>
         </w:rPr>
-        <w:t xml:space="preserve">If you submitted a sighting by accident, tap the ring on the map. If you are on the same device and browser that submitted it, you will see an "Undo My Sighting" button. Tapping it asks for confirmation, then removes the sighting immediately without admin involvement.</w:t>
-      </w:r>
-    </w:p>
-    <w:p>
-      <w:pPr>
-        <w:spacing w:after="80" w:before="60"/>
-      </w:pPr>
-      <w:r>
-        <w:rPr>
-          <w:rFonts w:ascii="Arial" w:cs="Arial" w:eastAsia="Arial" w:hAnsi="Arial"/>
-          <w:color w:val="222222"/>
-          <w:sz w:val="20"/>
-          <w:szCs w:val="20"/>
-        </w:rPr>
-        <w:t xml:space="preserve">If you are on a different device or the session has been cleared, tap "Request Removal" and add a reason. This sends the request to the admin queue for review.</w:t>
+        <w:t xml:space="preserve">Tap the sighting ring on the map. Same device: tap "Undo My Sighting" and confirm — removed immediately with no admin needed. Different device: tap "Request Removal", add a reason, and submit for admin review.</w:t>
       </w:r>
     </w:p>
     <w:p>
@@ -2468,6 +2509,59 @@
           <w:sz w:val="32"/>
           <w:szCs w:val="32"/>
         </w:rPr>
+        <w:t xml:space="preserve">Live Cams</w:t>
+      </w:r>
+    </w:p>
+    <w:p>
+      <w:pPr>
+        <w:spacing w:after="80" w:before="60"/>
+      </w:pPr>
+      <w:r>
+        <w:rPr>
+          <w:rFonts w:ascii="Arial" w:cs="Arial" w:eastAsia="Arial" w:hAnsi="Arial"/>
+          <w:color w:val="222222"/>
+          <w:sz w:val="20"/>
+          <w:szCs w:val="20"/>
+        </w:rPr>
+        <w:t xml:space="preserve">Toggle the Live Cams layer to see camera markers across the network. The map zooms to show the full region when toggled on. Tap any marker to open the popup with a snapshot refreshing every 60 seconds and a Watch Live button opening the stream in a new tab.</w:t>
+      </w:r>
+    </w:p>
+    <w:p>
+      <w:pPr>
+        <w:spacing w:after="80" w:before="60"/>
+      </w:pPr>
+      <w:r>
+        <w:rPr>
+          <w:rFonts w:ascii="Arial" w:cs="Arial" w:eastAsia="Arial" w:hAnsi="Arial"/>
+          <w:color w:val="222222"/>
+          <w:sz w:val="20"/>
+          <w:szCs w:val="20"/>
+        </w:rPr>
+        <w:t xml:space="preserve">New cameras are added via Supabase with no code deploy needed. For YouTube streams use the embed URL format with the si parameter from the Share → Embed dialog.</w:t>
+      </w:r>
+    </w:p>
+    <w:p>
+      <w:pPr>
+        <w:pBdr>
+          <w:bottom w:val="single" w:color="DDDDDD" w:sz="4"/>
+        </w:pBdr>
+        <w:spacing w:after="200" w:before="200"/>
+      </w:pPr>
+    </w:p>
+    <w:p>
+      <w:pPr>
+        <w:pStyle w:val="Heading1"/>
+        <w:spacing w:after="120" w:before="360"/>
+      </w:pPr>
+      <w:r>
+        <w:rPr>
+          <w:rFonts w:ascii="Arial" w:cs="Arial" w:eastAsia="Arial" w:hAnsi="Arial"/>
+          <w:b/>
+          <w:bCs/>
+          <w:color w:val="1A1A2E"/>
+          <w:sz w:val="32"/>
+          <w:szCs w:val="32"/>
+        </w:rPr>
         <w:t xml:space="preserve">Camera Settings Advisor</w:t>
       </w:r>
     </w:p>
@@ -2482,7 +2576,7 @@
           <w:sz w:val="20"/>
           <w:szCs w:val="20"/>
         </w:rPr>
-        <w:t xml:space="preserve">The camera advisor calculates recommended aurora photography settings based on your device, location, and current conditions.</w:t>
+        <w:t xml:space="preserve">Tap the camera icon, then tap your shooting location on the map. The panel opens with auto-populated Bortle, latitude, moon conditions, and live aurora intensity.</w:t>
       </w:r>
     </w:p>
     <w:p>
@@ -2499,7 +2593,7 @@
           <w:sz w:val="24"/>
           <w:szCs w:val="24"/>
         </w:rPr>
-        <w:t xml:space="preserve">How to Use</w:t>
+        <w:t xml:space="preserve">Device Selection</w:t>
       </w:r>
     </w:p>
     <w:p>
@@ -2518,7 +2612,7 @@
           <w:sz w:val="20"/>
           <w:szCs w:val="20"/>
         </w:rPr>
-        <w:t xml:space="preserve">Tap 📷 on the map — cursor changes to crosshair</w:t>
+        <w:t xml:space="preserve">iPhone: pick your model from the dropdown — specs are looked up automatically</w:t>
       </w:r>
     </w:p>
     <w:p>
@@ -2537,7 +2631,7 @@
           <w:sz w:val="20"/>
           <w:szCs w:val="20"/>
         </w:rPr>
-        <w:t xml:space="preserve">Tap your shooting location on the map</w:t>
+        <w:t xml:space="preserve">Android: pick manufacturer and model — specs looked up automatically</w:t>
       </w:r>
     </w:p>
     <w:p>
@@ -2556,121 +2650,21 @@
           <w:sz w:val="20"/>
           <w:szCs w:val="20"/>
         </w:rPr>
-        <w:t xml:space="preserve">The panel opens with auto-detected Bortle, latitude, moon data, and live aurora intensity</w:t>
-      </w:r>
-    </w:p>
-    <w:p>
-      <w:pPr>
-        <w:pStyle w:val="ListParagraph"/>
-        <w:numPr>
-          <w:ilvl w:val="0"/>
-          <w:numId w:val="2"/>
-        </w:numPr>
-        <w:spacing w:after="40" w:before="40"/>
-      </w:pPr>
-      <w:r>
-        <w:rPr>
-          <w:rFonts w:ascii="Arial" w:cs="Arial" w:eastAsia="Arial" w:hAnsi="Arial"/>
-          <w:color w:val="222222"/>
-          <w:sz w:val="20"/>
-          <w:szCs w:val="20"/>
-        </w:rPr>
-        <w:t xml:space="preserve">Select your device type — iPhone, Android, or DSLR/Mirrorless</w:t>
-      </w:r>
-    </w:p>
-    <w:p>
-      <w:pPr>
-        <w:pStyle w:val="ListParagraph"/>
-        <w:numPr>
-          <w:ilvl w:val="0"/>
-          <w:numId w:val="2"/>
-        </w:numPr>
-        <w:spacing w:after="40" w:before="40"/>
-      </w:pPr>
-      <w:r>
-        <w:rPr>
-          <w:rFonts w:ascii="Arial" w:cs="Arial" w:eastAsia="Arial" w:hAnsi="Arial"/>
-          <w:color w:val="222222"/>
-          <w:sz w:val="20"/>
-          <w:szCs w:val="20"/>
-        </w:rPr>
-        <w:t xml:space="preserve">For phones: pick your model from the dropdown — specs are looked up automatically</w:t>
-      </w:r>
-    </w:p>
-    <w:p>
-      <w:pPr>
-        <w:pStyle w:val="ListParagraph"/>
-        <w:numPr>
-          <w:ilvl w:val="0"/>
-          <w:numId w:val="2"/>
-        </w:numPr>
-        <w:spacing w:after="40" w:before="40"/>
-      </w:pPr>
-      <w:r>
-        <w:rPr>
-          <w:rFonts w:ascii="Arial" w:cs="Arial" w:eastAsia="Arial" w:hAnsi="Arial"/>
-          <w:color w:val="222222"/>
-          <w:sz w:val="20"/>
-          <w:szCs w:val="20"/>
-        </w:rPr>
-        <w:t xml:space="preserve">For DSLRs: enter sensor size, focal length, and widest aperture</w:t>
-      </w:r>
-    </w:p>
-    <w:p>
-      <w:pPr>
-        <w:pStyle w:val="ListParagraph"/>
-        <w:numPr>
-          <w:ilvl w:val="0"/>
-          <w:numId w:val="2"/>
-        </w:numPr>
-        <w:spacing w:after="40" w:before="40"/>
-      </w:pPr>
-      <w:r>
-        <w:rPr>
-          <w:rFonts w:ascii="Arial" w:cs="Arial" w:eastAsia="Arial" w:hAnsi="Arial"/>
-          <w:color w:val="222222"/>
-          <w:sz w:val="20"/>
-          <w:szCs w:val="20"/>
-        </w:rPr>
-        <w:t xml:space="preserve">Check whether you have a tripod (and star tracker for DSLRs)</w:t>
-      </w:r>
-    </w:p>
-    <w:p>
-      <w:pPr>
-        <w:pStyle w:val="ListParagraph"/>
-        <w:numPr>
-          <w:ilvl w:val="0"/>
-          <w:numId w:val="2"/>
-        </w:numPr>
-        <w:spacing w:after="40" w:before="40"/>
-      </w:pPr>
-      <w:r>
-        <w:rPr>
-          <w:rFonts w:ascii="Arial" w:cs="Arial" w:eastAsia="Arial" w:hAnsi="Arial"/>
-          <w:color w:val="222222"/>
-          <w:sz w:val="20"/>
-          <w:szCs w:val="20"/>
-        </w:rPr>
-        <w:t xml:space="preserve">Optionally override any condition — Bortle, moon, latitude, or aurora intensity</w:t>
-      </w:r>
-    </w:p>
-    <w:p>
-      <w:pPr>
-        <w:pStyle w:val="ListParagraph"/>
-        <w:numPr>
-          <w:ilvl w:val="0"/>
-          <w:numId w:val="2"/>
-        </w:numPr>
-        <w:spacing w:after="40" w:before="40"/>
-      </w:pPr>
-      <w:r>
-        <w:rPr>
-          <w:rFonts w:ascii="Arial" w:cs="Arial" w:eastAsia="Arial" w:hAnsi="Arial"/>
-          <w:color w:val="222222"/>
-          <w:sz w:val="20"/>
-          <w:szCs w:val="20"/>
-        </w:rPr>
-        <w:t xml:space="preserve">Tap GET SETTINGS for your recommended output card</w:t>
+        <w:t xml:space="preserve">DSLR/Mirrorless: enter sensor size, focal length, and widest aperture</w:t>
+      </w:r>
+    </w:p>
+    <w:p>
+      <w:pPr>
+        <w:spacing w:after="80" w:before="60"/>
+      </w:pPr>
+      <w:r>
+        <w:rPr>
+          <w:rFonts w:ascii="Arial" w:cs="Arial" w:eastAsia="Arial" w:hAnsi="Arial"/>
+          <w:color w:val="222222"/>
+          <w:sz w:val="20"/>
+          <w:szCs w:val="20"/>
+        </w:rPr>
+        <w:t xml:space="preserve">Check whether you have a tripod. DSLRs also have a star tracker option.</w:t>
       </w:r>
     </w:p>
     <w:p>
@@ -2701,21 +2695,7 @@
           <w:sz w:val="20"/>
           <w:szCs w:val="20"/>
         </w:rPr>
-        <w:t xml:space="preserve">The output card shows: Mode, Aperture, Shutter speed, ISO, White balance, Focus instructions, Format recommendation, and contextual warnings about moon interference or light pollution.</w:t>
-      </w:r>
-    </w:p>
-    <w:p>
-      <w:pPr>
-        <w:spacing w:after="80" w:before="60"/>
-      </w:pPr>
-      <w:r>
-        <w:rPr>
-          <w:rFonts w:ascii="Arial" w:cs="Arial" w:eastAsia="Arial" w:hAnsi="Arial"/>
-          <w:color w:val="222222"/>
-          <w:sz w:val="20"/>
-          <w:szCs w:val="20"/>
-        </w:rPr>
-        <w:t xml:space="preserve">A creative note explains the tradeoff: longer exposure = more color and smooth gradients, shorter exposure = sharper structure and ribbon detail.</w:t>
+        <w:t xml:space="preserve">The card shows Mode, Aperture, Shutter speed, ISO, White balance, Focus instructions, Format recommendation, and contextual warnings about moon or light pollution. A creative note explains the tradeoff: longer exposure gives more color and smooth gradients, shorter exposure gives sharper structure and ribbon detail.</w:t>
       </w:r>
     </w:p>
     <w:p>
@@ -2732,6 +2712,37 @@
           <w:sz w:val="24"/>
           <w:szCs w:val="24"/>
         </w:rPr>
+        <w:t xml:space="preserve">Overriding Conditions</w:t>
+      </w:r>
+    </w:p>
+    <w:p>
+      <w:pPr>
+        <w:spacing w:after="80" w:before="60"/>
+      </w:pPr>
+      <w:r>
+        <w:rPr>
+          <w:rFonts w:ascii="Arial" w:cs="Arial" w:eastAsia="Arial" w:hAnsi="Arial"/>
+          <w:color w:val="222222"/>
+          <w:sz w:val="20"/>
+          <w:szCs w:val="20"/>
+        </w:rPr>
+        <w:t xml:space="preserve">Any condition can be overridden manually — Bortle, moon up/down, moon illumination percentage, latitude, and aurora intensity. Useful when shooting in an area outside the grid coverage or when you know local conditions differ from the data.</w:t>
+      </w:r>
+    </w:p>
+    <w:p>
+      <w:pPr>
+        <w:pStyle w:val="Heading2"/>
+        <w:spacing w:after="80" w:before="240"/>
+      </w:pPr>
+      <w:r>
+        <w:rPr>
+          <w:rFonts w:ascii="Arial" w:cs="Arial" w:eastAsia="Arial" w:hAnsi="Arial"/>
+          <w:b/>
+          <w:bCs/>
+          <w:color w:val="1A7A6E"/>
+          <w:sz w:val="24"/>
+          <w:szCs w:val="24"/>
+        </w:rPr>
         <w:t xml:space="preserve">Troubleshooter</w:t>
       </w:r>
     </w:p>
@@ -2746,7 +2757,7 @@
           <w:sz w:val="20"/>
           <w:szCs w:val="20"/>
         </w:rPr>
-        <w:t xml:space="preserve">Tap TROUBLESHOOT A PROBLEM at the bottom of the results card. Check one or more symptom boxes and tap GET FIXES. Each fix references your actual entered settings with specific values — not generic advice.</w:t>
+        <w:t xml:space="preserve">Tap TROUBLESHOOT A PROBLEM at the bottom of the results. Check symptom boxes and tap GET FIXES for advice referencing your actual entered settings.</w:t>
       </w:r>
     </w:p>
     <w:tbl>
@@ -2884,7 +2895,7 @@
                 <w:sz w:val="18"/>
                 <w:szCs w:val="18"/>
               </w:rPr>
-              <w:t xml:space="preserve">Raise ISO one stop or increase shutter 50%</w:t>
+              <w:t xml:space="preserve">Raise ISO or increase shutter up to motion limit</w:t>
             </w:r>
           </w:p>
         </w:tc>
@@ -2944,7 +2955,7 @@
                 <w:sz w:val="18"/>
                 <w:szCs w:val="18"/>
               </w:rPr>
-              <w:t xml:space="preserve">Lower ISO one stop or decrease shutter 30%</w:t>
+              <w:t xml:space="preserve">Lower ISO or decrease shutter</w:t>
             </w:r>
           </w:p>
         </w:tc>
@@ -3004,7 +3015,7 @@
                 <w:sz w:val="18"/>
                 <w:szCs w:val="18"/>
               </w:rPr>
-              <w:t xml:space="preserve">Lower ISO, increase shutter to compensate</w:t>
+              <w:t xml:space="preserve">Lower ISO, increase shutter to compensate, shoot RAW</w:t>
             </w:r>
           </w:p>
         </w:tc>
@@ -3184,7 +3195,7 @@
                 <w:sz w:val="18"/>
                 <w:szCs w:val="18"/>
               </w:rPr>
-              <w:t xml:space="preserve">Shorten shutter to NPF limit for your focal length</w:t>
+              <w:t xml:space="preserve">Shorten to NPF limit for your focal length</w:t>
             </w:r>
           </w:p>
         </w:tc>
@@ -3304,7 +3315,7 @@
                 <w:sz w:val="18"/>
                 <w:szCs w:val="18"/>
               </w:rPr>
-              <w:t xml:space="preserve">Re-focus manually on a bright star</w:t>
+              <w:t xml:space="preserve">Re-focus manually on brightest star</w:t>
             </w:r>
           </w:p>
         </w:tc>
@@ -3346,7 +3357,7 @@
           <w:sz w:val="20"/>
           <w:szCs w:val="20"/>
         </w:rPr>
-        <w:t xml:space="preserve">Enter the admin passphrase in the bottom bar password field and tap GO. The QUEUE button appears.</w:t>
+        <w:t xml:space="preserve">Enter the admin passphrase and tap GO. An orange badge appears on the admin area whenever items are waiting. Tap QUEUE to open the admin panel.</w:t>
       </w:r>
     </w:p>
     <w:p>
@@ -3377,7 +3388,7 @@
           <w:sz w:val="20"/>
           <w:szCs w:val="20"/>
         </w:rPr>
-        <w:t xml:space="preserve">Pending location submissions. Each card shows the spot details with links to view on the app map, Apple Maps, and Google Maps. APPROVE adds the spot publicly. REJECT soft-deletes with a timestamp for audit history.</w:t>
+        <w:t xml:space="preserve">Pending submissions with links to view on the app map, Apple Maps, and Google Maps. APPROVE adds the spot publicly. REJECT soft-deletes it with a timestamp.</w:t>
       </w:r>
     </w:p>
     <w:p>
@@ -3439,7 +3450,7 @@
           <w:sz w:val="20"/>
           <w:szCs w:val="20"/>
         </w:rPr>
-        <w:t xml:space="preserve">Photos flagged by community members. DELETE permanently removes the photo. DISMISS clears the flag and leaves the photo published.</w:t>
+        <w:t xml:space="preserve">Community-flagged photos. DELETE permanently removes. DISMISS clears the flag and keeps the photo published.</w:t>
       </w:r>
     </w:p>
     <w:p>
@@ -3470,38 +3481,7 @@
           <w:sz w:val="20"/>
           <w:szCs w:val="20"/>
         </w:rPr>
-        <w:t xml:space="preserve">Sighting removal requests submitted by users who cannot undo from their original device. Each card shows the sighting details and the user's reason. DELETE (with confirmation) permanently removes the sighting. DISMISS (with confirmation) clears the request and leaves the sighting on the map.</w:t>
-      </w:r>
-    </w:p>
-    <w:p>
-      <w:pPr>
-        <w:pStyle w:val="Heading2"/>
-        <w:spacing w:after="80" w:before="240"/>
-      </w:pPr>
-      <w:r>
-        <w:rPr>
-          <w:rFonts w:ascii="Arial" w:cs="Arial" w:eastAsia="Arial" w:hAnsi="Arial"/>
-          <w:b/>
-          <w:bCs/>
-          <w:color w:val="1A7A6E"/>
-          <w:sz w:val="24"/>
-          <w:szCs w:val="24"/>
-        </w:rPr>
-        <w:t xml:space="preserve">Deleting Sightings from the Map</w:t>
-      </w:r>
-    </w:p>
-    <w:p>
-      <w:pPr>
-        <w:spacing w:after="80" w:before="60"/>
-      </w:pPr>
-      <w:r>
-        <w:rPr>
-          <w:rFonts w:ascii="Arial" w:cs="Arial" w:eastAsia="Arial" w:hAnsi="Arial"/>
-          <w:color w:val="222222"/>
-          <w:sz w:val="20"/>
-          <w:szCs w:val="20"/>
-        </w:rPr>
-        <w:t xml:space="preserve">When admin is active, tapping any sighting ring shows an ADMIN DELETE button in the popup. Tap it and confirm to remove immediately.</w:t>
+        <w:t xml:space="preserve">Removal requests from users who cannot undo from their original device. DELETE (with confirmation) permanently removes. DISMISS (with confirmation) clears the request and keeps the sighting on the map.</w:t>
       </w:r>
     </w:p>
     <w:p>
@@ -3526,7 +3506,7 @@
           <w:sz w:val="32"/>
           <w:szCs w:val="32"/>
         </w:rPr>
-        <w:t xml:space="preserve">Troubleshooting the App</w:t>
+        <w:t xml:space="preserve">Troubleshooting</w:t>
       </w:r>
     </w:p>
     <w:tbl>
@@ -3874,7 +3854,7 @@
                 <w:sz w:val="18"/>
                 <w:szCs w:val="18"/>
               </w:rPr>
-              <w:t xml:space="preserve">Supabase connection failed or rejected column missing</w:t>
+              <w:t xml:space="preserve">Supabase connection or schema issue</w:t>
             </w:r>
           </w:p>
         </w:tc>
@@ -3903,7 +3883,7 @@
                 <w:sz w:val="18"/>
                 <w:szCs w:val="18"/>
               </w:rPr>
-              <w:t xml:space="preserve">Run database migration SQL, then reload</w:t>
+              <w:t xml:space="preserve">Run migration SQL, reload</w:t>
             </w:r>
           </w:p>
         </w:tc>
@@ -3992,7 +3972,7 @@
                 <w:sz w:val="18"/>
                 <w:szCs w:val="18"/>
               </w:rPr>
-              <w:t xml:space="preserve">Check config.js cloud name; app compresses to 8MB</w:t>
+              <w:t xml:space="preserve">Check config.js cloud name</w:t>
             </w:r>
           </w:p>
         </w:tc>
@@ -4023,7 +4003,7 @@
                 <w:sz w:val="18"/>
                 <w:szCs w:val="18"/>
               </w:rPr>
-              <w:t xml:space="preserve">Camera advisor shows Bortle 5 in arctic</w:t>
+              <w:t xml:space="preserve">Camera popup shows black</w:t>
             </w:r>
           </w:p>
         </w:tc>
@@ -4052,7 +4032,7 @@
                 <w:sz w:val="18"/>
                 <w:szCs w:val="18"/>
               </w:rPr>
-              <w:t xml:space="preserve">Outside grid coverage</w:t>
+              <w:t xml:space="preserve">YouTube embedding restricted</w:t>
             </w:r>
           </w:p>
         </w:tc>
@@ -4081,7 +4061,7 @@
                 <w:sz w:val="18"/>
                 <w:szCs w:val="18"/>
               </w:rPr>
-              <w:t xml:space="preserve">Use the override toggle to set Bortle manually</w:t>
+              <w:t xml:space="preserve">Use Watch Live button to open in new tab</w:t>
             </w:r>
           </w:p>
         </w:tc>
@@ -4112,7 +4092,7 @@
                 <w:sz w:val="18"/>
                 <w:szCs w:val="18"/>
               </w:rPr>
-              <w:t xml:space="preserve">Sighting rings jump on pan</w:t>
+              <w:t xml:space="preserve">Cam image not updating</w:t>
             </w:r>
           </w:p>
         </w:tc>
@@ -4141,7 +4121,7 @@
                 <w:sz w:val="18"/>
                 <w:szCs w:val="18"/>
               </w:rPr>
-              <w:t xml:space="preserve">Canvas positioning issue</w:t>
+              <w:t xml:space="preserve">Camera offline or image URL changed</w:t>
             </w:r>
           </w:p>
         </w:tc>
@@ -4170,7 +4150,96 @@
                 <w:sz w:val="18"/>
                 <w:szCs w:val="18"/>
               </w:rPr>
-              <w:t xml:space="preserve">Hard refresh (Ctrl+Shift+R)</w:t>
+              <w:t xml:space="preserve">Set is_active=false in Supabase or update image_url</w:t>
+            </w:r>
+          </w:p>
+        </w:tc>
+      </w:tr>
+      <w:tr>
+        <w:tc>
+          <w:tcPr>
+            <w:tcW w:type="dxa" w:w="3120"/>
+            <w:tcBorders>
+              <w:top w:val="single" w:color="CCCCCC" w:sz="1"/>
+              <w:left w:val="single" w:color="CCCCCC" w:sz="1"/>
+              <w:bottom w:val="single" w:color="CCCCCC" w:sz="1"/>
+              <w:right w:val="single" w:color="CCCCCC" w:sz="1"/>
+            </w:tcBorders>
+            <w:shd w:fill="F5FAFA" w:val="clear"/>
+            <w:tcMar>
+              <w:top w:type="dxa" w:w="80"/>
+              <w:left w:type="dxa" w:w="120"/>
+              <w:bottom w:type="dxa" w:w="80"/>
+              <w:right w:type="dxa" w:w="120"/>
+            </w:tcMar>
+          </w:tcPr>
+          <w:p>
+            <w:r>
+              <w:rPr>
+                <w:rFonts w:ascii="Arial" w:cs="Arial" w:eastAsia="Arial" w:hAnsi="Arial"/>
+                <w:color w:val="222222"/>
+                <w:sz w:val="18"/>
+                <w:szCs w:val="18"/>
+              </w:rPr>
+              <w:t xml:space="preserve">Bortle shows wrong value</w:t>
+            </w:r>
+          </w:p>
+        </w:tc>
+        <w:tc>
+          <w:tcPr>
+            <w:tcW w:type="dxa" w:w="3120"/>
+            <w:tcBorders>
+              <w:top w:val="single" w:color="CCCCCC" w:sz="1"/>
+              <w:left w:val="single" w:color="CCCCCC" w:sz="1"/>
+              <w:bottom w:val="single" w:color="CCCCCC" w:sz="1"/>
+              <w:right w:val="single" w:color="CCCCCC" w:sz="1"/>
+            </w:tcBorders>
+            <w:shd w:fill="F5FAFA" w:val="clear"/>
+            <w:tcMar>
+              <w:top w:type="dxa" w:w="80"/>
+              <w:left w:type="dxa" w:w="120"/>
+              <w:bottom w:type="dxa" w:w="80"/>
+              <w:right w:type="dxa" w:w="120"/>
+            </w:tcMar>
+          </w:tcPr>
+          <w:p>
+            <w:r>
+              <w:rPr>
+                <w:rFonts w:ascii="Arial" w:cs="Arial" w:eastAsia="Arial" w:hAnsi="Arial"/>
+                <w:color w:val="222222"/>
+                <w:sz w:val="18"/>
+                <w:szCs w:val="18"/>
+              </w:rPr>
+              <w:t xml:space="preserve">Grid resolution gap</w:t>
+            </w:r>
+          </w:p>
+        </w:tc>
+        <w:tc>
+          <w:tcPr>
+            <w:tcW w:type="dxa" w:w="3120"/>
+            <w:tcBorders>
+              <w:top w:val="single" w:color="CCCCCC" w:sz="1"/>
+              <w:left w:val="single" w:color="CCCCCC" w:sz="1"/>
+              <w:bottom w:val="single" w:color="CCCCCC" w:sz="1"/>
+              <w:right w:val="single" w:color="CCCCCC" w:sz="1"/>
+            </w:tcBorders>
+            <w:shd w:fill="F5FAFA" w:val="clear"/>
+            <w:tcMar>
+              <w:top w:type="dxa" w:w="80"/>
+              <w:left w:type="dxa" w:w="120"/>
+              <w:bottom w:type="dxa" w:w="80"/>
+              <w:right w:type="dxa" w:w="120"/>
+            </w:tcMar>
+          </w:tcPr>
+          <w:p>
+            <w:r>
+              <w:rPr>
+                <w:rFonts w:ascii="Arial" w:cs="Arial" w:eastAsia="Arial" w:hAnsi="Arial"/>
+                <w:color w:val="222222"/>
+                <w:sz w:val="18"/>
+                <w:szCs w:val="18"/>
+              </w:rPr>
+              <w:t xml:space="preserve">Use OVERRIDE in spot form or camera advisor</w:t>
             </w:r>
           </w:p>
         </w:tc>
@@ -4412,15 +4481,6 @@
       <w:lvlJc w:val="left"/>
       <w:pPr>
         <w:ind w:left="720" w:hanging="360"/>
-      </w:pPr>
-    </w:lvl>
-    <w:lvl w:ilvl="1" w15:tentative="1">
-      <w:start w:val="1"/>
-      <w:numFmt w:val="bullet"/>
-      <w:lvlText w:val="◦"/>
-      <w:lvlJc w:val="left"/>
-      <w:pPr>
-        <w:ind w:left="1080" w:hanging="360"/>
       </w:pPr>
     </w:lvl>
   </w:abstractNum>
@@ -4622,39 +4682,5 @@
       <w:szCs w:val="20"/>
     </w:rPr>
   </w:style>
-  <w:style w:type="paragraph" w:styleId="Heading1">
-    <w:name w:val="Heading 1"/>
-    <w:basedOn w:val="Normal"/>
-    <w:next w:val="Normal"/>
-    <w:qFormat/>
-    <w:pPr>
-      <w:spacing w:after="120" w:before="360"/>
-      <w:outlineLvl w:val="0"/>
-    </w:pPr>
-    <w:rPr>
-      <w:rFonts w:ascii="Arial" w:cs="Arial" w:eastAsia="Arial" w:hAnsi="Arial"/>
-      <w:b/>
-      <w:bCs/>
-      <w:sz w:val="32"/>
-      <w:szCs w:val="32"/>
-    </w:rPr>
-  </w:style>
-  <w:style w:type="paragraph" w:styleId="Heading2">
-    <w:name w:val="Heading 2"/>
-    <w:basedOn w:val="Normal"/>
-    <w:next w:val="Normal"/>
-    <w:qFormat/>
-    <w:pPr>
-      <w:spacing w:after="80" w:before="240"/>
-      <w:outlineLvl w:val="1"/>
-    </w:pPr>
-    <w:rPr>
-      <w:rFonts w:ascii="Arial" w:cs="Arial" w:eastAsia="Arial" w:hAnsi="Arial"/>
-      <w:b/>
-      <w:bCs/>
-      <w:sz w:val="24"/>
-      <w:szCs w:val="24"/>
-    </w:rPr>
-  </w:style>
 </w:styles>
 </file>
</xml_diff>